<commit_message>
thesis: regenerate Word doc (all 9 chapters, figures, tables, numbered cross-refs)
</commit_message>
<xml_diff>
--- a/thesis/Bachelorarbeit_FHNW.docx
+++ b/thesis/Bachelorarbeit_FHNW.docx
@@ -1391,7 +1391,7 @@
         <w:pStyle w:val="Textkrper"/>
       </w:pPr>
       <w:r>
-        <w:t>[Platzhalter: Das Management Summary wird zuletzt verfasst. Aufbau: Ausgangslage und Fragestellung, gewähltes Vorgehen und Methoden, Hauptergebnisse (grösste Gewichtung), Fazit und Ausblick. Umfang i.d.R. 1, max. 2 Seiten.]</w:t>
+        <w:t>[Platzhalter: Management Summary zuletzt verfassen. Aufbau: Ausgangslage und Fragestellung, Vorgehen und Methoden, Hauptergebnisse (grösste Gewichtung), Fazit und Ausblick. Max. 2 Seiten.]</w:t>
       </w:r>
     </w:p>
     <w:p>
@@ -3394,6 +3394,7 @@
       <w:r>
         <w:rPr>
           <w:b/>
+          <w:i w:val="0"/>
         </w:rPr>
         <w:t>H1 (Prognosequalität):</w:t>
       </w:r>
@@ -3414,6 +3415,7 @@
       <w:r>
         <w:rPr>
           <w:b/>
+          <w:i w:val="0"/>
         </w:rPr>
         <w:t>H2 (Ereignisreaktion):</w:t>
       </w:r>
@@ -3434,6 +3436,7 @@
       <w:r>
         <w:rPr>
           <w:b/>
+          <w:i w:val="0"/>
         </w:rPr>
         <w:t>H3 (Wallet-Timing):</w:t>
       </w:r>
@@ -3536,6 +3539,7 @@
       </w:r>
       <w:r>
         <w:rPr>
+          <w:b w:val="0"/>
           <w:i/>
         </w:rPr>
         <w:t>Prognosemarkt</w:t>
@@ -3545,6 +3549,7 @@
       </w:r>
       <w:r>
         <w:rPr>
+          <w:b w:val="0"/>
           <w:i/>
         </w:rPr>
         <w:t>Informationelle Effizienz</w:t>
@@ -3557,15 +3562,17 @@
       <w:pPr/>
       <w:r>
         <w:rPr>
+          <w:b w:val="0"/>
           <w:i/>
         </w:rPr>
         <w:t>Kalibrierung</w:t>
       </w:r>
       <w:r>
-        <w:t xml:space="preserve"> meint die Uebereinstimmung von prognostizierter Wahrscheinlichkeit und beobachteter relativer Häufigkeit: Ereignisse, denen ein Markt 70 Prozent zuweist, sollten langfristig in etwa 70 Prozent der Fälle eintreten. </w:t>
-      </w:r>
-      <w:r>
-        <w:rPr>
+        <w:t xml:space="preserve"> meint die Übereinstimmung von prognostizierter Wahrscheinlichkeit und beobachteter relativer Häufigkeit: Ereignisse, denen ein Markt 70 Prozent zuweist, sollten langfristig in etwa 70 Prozent der Fälle eintreten. </w:t>
+      </w:r>
+      <w:r>
+        <w:rPr>
+          <w:b w:val="0"/>
           <w:i/>
         </w:rPr>
         <w:t>Polymarket</w:t>
@@ -3575,6 +3582,7 @@
       </w:r>
       <w:r>
         <w:rPr>
+          <w:b w:val="0"/>
           <w:i/>
         </w:rPr>
         <w:t>Wallet</w:t>
@@ -3584,6 +3592,7 @@
       </w:r>
       <w:r>
         <w:rPr>
+          <w:b w:val="0"/>
           <w:i/>
         </w:rPr>
         <w:t>Tier</w:t>
@@ -3603,13 +3612,13 @@
     <w:p>
       <w:pPr/>
       <w:r>
-        <w:t>Der theoretische Ausgangspunkt ist die Markteffizienzhypothese (Fama, 1970), nach der Preise verfügbare Information widerspiegeln. Ueblich ist die Unterscheidung in eine schwache, eine halbstrenge und eine strenge Form, je nachdem, ob historische Preise, alle öffentlichen Informationen oder auch private Informationen bereits eingepreist sind. Auf Prognosemärkte übertragen heisst das: Wenn genügend Teilnehmende ihre Erwartungen laufend an neue Evidenz anpassen, sollte der Marktpreis als Wahrscheinlichkeit die verfügbare Information bündeln.</w:t>
+        <w:t>Der theoretische Ausgangspunkt ist die Markteffizienzhypothese (Fama, 1970), nach der Preise verfügbare Information widerspiegeln. Üblich ist die Unterscheidung in eine schwache, eine halbstrenge und eine strenge Form, je nachdem, ob historische Preise, alle öffentlichen Informationen oder auch private Informationen bereits eingepreist sind. Auf Prognosemärkte übertragen heisst das: Wenn genügend Teilnehmende ihre Erwartungen laufend an neue Evidenz anpassen, sollte der Marktpreis als Wahrscheinlichkeit die verfügbare Information bündeln.</w:t>
       </w:r>
     </w:p>
     <w:p>
       <w:pPr/>
       <w:r>
-        <w:t>Diesen Aggregationsmechanismus beschreibt Hanson (2007) konzeptionell und verweist auf Vergleiche, in denen spekulative Märkte Experteneinschätzungen und Umfragen erreichen oder schlagen. Die Idee der Informationsaggregation (häufig als Weisheit der Vielen bezeichnet) motiviert überhaupt erst, einen Marktpreis als Forecast zu behandeln. Sie ist zugleich eine Annahme, die empirisch zu prüfen und nicht vorauszusetzen ist.</w:t>
+        <w:t>Diesen Aggregationsmechanismus beschreibt Hanson (2007) konzeptionell und verweist auf Vergleiche, in denen spekulative Märkte Experteneinschätzungen und Umfragen erreichen oder schlagen. Breiter zeigen Wolfers und Zitzewitz (2004), dass marktbasierte Forecasts meist treffsicher sind und einfache Benchmarks übertreffen, und ein interdisziplinäres Autorenkollektiv ordnet Prognosemärkte als legitimes, informationsaggregierendes Instrument ein (Arrow, 2008). Unter welchen Bedingungen der Marktpreis tatsächlich der mittleren Erwartung der Teilnehmenden entspricht, präzisieren Wolfers und Zitzewitz (2006). Zugleich mahnt Manski (2006) zur Vorsicht, weil Preise Erwartungen mit Risikopräferenzen vermengen, sodass die Gleichsetzung von Preis und Wahrscheinlichkeit nicht unbesehen gilt. Die Idee der Informationsaggregation (häufig als Weisheit der Vielen bezeichnet) motiviert daher, einen Marktpreis als Forecast zu behandeln, bleibt aber eine empirisch zu prüfende Annahme.</w:t>
       </w:r>
     </w:p>
     <w:p>
@@ -3623,7 +3632,7 @@
     <w:p>
       <w:pPr/>
       <w:r>
-        <w:t>Ob Märkte Umfragen tatsächlich überlegen sind, ist empirisch umstritten. Cutting et al. (2025) finden für die US-Wahl 2024 einen Vorteil von Polymarket gegenüber Umfragen, besonders in den umkämpften Swing States, und ordnen ihn der Wisdom-of-Crowds-Idee zu. Zugleich betonen sie ausdrücklich, dass die Ergebnisse weiterer Untersuchung und einer Prüfung auf Uebertragbarkeit bedürfen. Dem steht eine kritische Sicht gegenüber: Wu (2024) argumentiert, dass Prognosemärkte keine «Truth Machine» sind, sondern reflexiv sein können – Vertrauen in den Marktpreis kann die laufende Informationsaktualisierung schwächen und so die Genauigkeit untergraben.</w:t>
+        <w:t>Ob Märkte Umfragen tatsächlich überlegen sind, ist empirisch umstritten. Für die etablierten Iowa Electronic Markets zeigen Berg et al. (2008), dass Marktprognosen Umfragen über fünf Präsidentschaftswahlen hinweg in rund 74 Prozent der Vergleiche näher am Ergebnis lagen, mit eher wachsendem Vorsprung bei längerem Horizont, und Gruca und Rietz (2025) setzen diese Markt-Perspektive für die Wahl 2024 fort. Speziell für Polymarket finden Cutting et al. (2025) einen Vorteil gegenüber Umfragen, besonders in den umkämpften Swing States, und ordnen ihn der Wisdom-of-Crowds-Idee zu. Zugleich betonen sie ausdrücklich, dass die Ergebnisse weiterer Untersuchung und einer Prüfung auf Übertragbarkeit bedürfen. Dem steht eine kritische Sicht gegenüber: Wu (2024) argumentiert, dass Prognosemärkte keine «Truth Machine» sind, sondern reflexiv sein können – Vertrauen in den Marktpreis kann die laufende Informationsaktualisierung schwächen und so die Genauigkeit untergraben. Eine plattformübergreifende Auswertung relativiert das Bild zusätzlich: Clinton und Huang (2025) berichten für 2024 stark schwankende Trefferquoten zwischen den Börsen, wobei Polymarket nicht durchgehend führte.</w:t>
       </w:r>
     </w:p>
     <w:p>
@@ -3643,7 +3652,7 @@
     <w:p>
       <w:pPr/>
       <w:r>
-        <w:t>Zur Messung der Forecast-Qualität dient der Brier-Score (Brier, 1950), definiert als mittlere quadratische Abweichung zwischen Wahrscheinlichkeitsprognose und tatsächlichem Ausgang. Ein niedrigerer Brier-Verlust bedeutet eine bessere Prognose, und der Score belohnt sowohl Treffsicherheit als auch gute Kalibrierung. Der Vergleich zweier Verlustreihen erfolgt mit dem Diebold-Mariano-Test (Diebold &amp; Mariano, 1995), der prüft, ob zwei Prognosen im Mittel gleich genau sind, ohne einen bestimmten Entstehungsmechanismus zu unterstellen. Beide Verfahren gelten als etablierte, deterministisch berechenbare Masse der Forecast-Bewertung und bilden die methodische Grundlage von H1.</w:t>
+        <w:t>Zur Messung der Forecast-Qualität dient der Brier-Score (Brier, 1950), definiert als mittlere quadratische Abweichung zwischen Wahrscheinlichkeitsprognose und tatsächlichem Ausgang. Ein niedrigerer Brier-Verlust bedeutet eine bessere Prognose, und der Score belohnt sowohl Treffsicherheit als auch gute Kalibrierung. Formal ist der Brier-Score eine strikt-proper Scoring Rule (Gneiting &amp; Raftery, 2007), das heisst, die erwartete Bewertung wird genau dann minimiert, wenn die wahren Wahrscheinlichkeiten berichtet werden – strategisches Verzerren lohnt sich nicht. Der Vergleich zweier Verlustreihen erfolgt mit dem Diebold-Mariano-Test (Diebold &amp; Mariano, 1995), der prüft, ob zwei Prognosen im Mittel gleich genau sind, ohne einen bestimmten Entstehungsmechanismus zu unterstellen. Beide Verfahren gelten als etablierte, deterministisch berechenbare Masse der Forecast-Bewertung und bilden die methodische Grundlage von H1.</w:t>
       </w:r>
     </w:p>
     <w:p>
@@ -3677,7 +3686,15 @@
     <w:p>
       <w:pPr/>
       <w:r>
-        <w:t>Für die gebotene Vorsicht sprechen mehrere Befunde. Tsang und Yang (2026) zeigen für die Oktober-Grosskonto-Episode 2024, dass Kapital gleichzeitig auf beide Marktseiten floss – ein Muster, das mit heterogenen Erwartungen und nicht mit einseitiger Manipulation vereinbar ist. Rezabek (2024) ergänzt Verhaltensverzerrungen, etwa die Ueberschätzung kleiner Wahrscheinlichkeiten, sowie eine im Vergleich zu traditionellen Instrumenten höhere Volatilität. In der Praxis setzt Polymarket inzwischen eine On-Chain-Ueberwachung ein, die unter anderem ungewöhnliche Positionsgrössen vor Ergebnissen flaggt (Decrypt, 2026), gestützt auf forensische Heuristiken wie Funding-Quellen und Wallet-Clustering (Chainalysis, 2024). Diese Arbeiten liefern gemeinsam eine Signatur informierten Handels, ohne dass einzelne Adressen damit als Insider bewiesen wären.</w:t>
+        <w:t>Für die gebotene Vorsicht sprechen mehrere Befunde. Tsang und Yang (2026) zeigen für die Oktober-Grosskonto-Episode 2024, dass Kapital gleichzeitig auf beide Marktseiten floss – ein Muster, das mit heterogenen Erwartungen und nicht mit einseitiger Ma</w:t>
+      </w:r>
+    </w:p>
+    <w:p>
+      <w:pPr>
+        <w:pStyle w:val="berschrift1"/>
+      </w:pPr>
+      <w:r>
+        <w:t>Daten und Methodik</w:t>
       </w:r>
     </w:p>
     <w:p>
@@ -3685,13 +3702,522 @@
         <w:pStyle w:val="berschrift2"/>
       </w:pPr>
       <w:r>
-        <w:t>Forschungslücke</w:t>
+        <w:t>Forschungsdesign: deterministischer Kern vor Interpretation</w:t>
       </w:r>
     </w:p>
     <w:p>
       <w:pPr/>
       <w:r>
-        <w:t>Die Literatur liefert Theorie zur Aggregation und Effizienz, etablierte Methodik (Brier, Diebold-Mariano, Ereignisstudien, Granger) und gemischte Evidenz zu Polymarket. Diese Bausteine werden jedoch meist getrennt behandelt: Prognosequalität, Ereignisreaktion und On-Chain-Timing erscheinen in unterschiedlichen Arbeiten und selten für denselben Marktkontext. Was fehlt, ist eine reproduzierbare, deterministisch geprüfte Zusammenführung dieser drei Perspektiven für einen gemeinsamen Fall. Genau diese Lücke schliesst die vorliegende Arbeit für die US-Wahl 2024, indem sie H1, H2 und H3 auf derselben Datenbasis und mit nachvollziehbaren, vorab festgelegten Verfahren untersucht.</w:t>
+        <w:t>Die Arbeit prüft informationelle Effizienz nicht als direkt beobachtbare Eigenschaft, sondern über drei reproduzierbare Proxy-Tests: Prognosequalität (H1), Ereignisreaktion (H2) und Wallet-Timing (H3). Diese Operationalisierung folgt dem Effizienzbegriff der Markteffizienzhypothese (Fama, 1970) und überträgt ihn auf einen dezentralen Prognosemarkt, dessen Preispfad als primäre Zeitreihe behandelt wird.</w:t>
+      </w:r>
+    </w:p>
+    <w:p>
+      <w:pPr/>
+      <w:r>
+        <w:t>Methodisch gilt eine strikte Trennung: Alle statistischen Kennzahlen werden deterministisch in Python berechnet, versioniert und als Artefakt (CSV, JSON, PNG) abgelegt. Sprachmodelle oder Agenten berechnen keine Metriken, sie dürfen ausschliesslich bereits berechnete, begrenzte Ergebnisse interpretieren, und auch das erst nach dokumentierter Freigabe und Audit-Protokollierung. Diese Reihenfolge – Datenvalidierung, deterministische Analyse, danach Interpretation – sichert Nachvollziehbarkeit und schützt vor versteckten Berechnungen im Fliesstext.</w:t>
+      </w:r>
+    </w:p>
+    <w:p>
+      <w:pPr>
+        <w:pStyle w:val="berschrift2"/>
+      </w:pPr>
+      <w:r>
+        <w:t>Datenbasis</w:t>
+      </w:r>
+    </w:p>
+    <w:p>
+      <w:pPr/>
+      <w:r>
+        <w:t>Die empirische Basis liegt in einer lokalen SQLite-Datenbank (</w:t>
+      </w:r>
+      <w:r>
+        <w:rPr>
+          <w:b w:val="0"/>
+          <w:i/>
+        </w:rPr>
+        <w:t>data/thesis.db</w:t>
+      </w:r>
+      <w:r>
+        <w:t>). Tabelle fasst Quellen, Zeilenzahlen und bekannte Einschränkungen zusammen.</w:t>
+      </w:r>
+    </w:p>
+    <w:tbl>
+      <w:tblPr>
+        <w:tblStyle w:val="Tabellenraster"/>
+        <w:tblW w:type="auto" w:w="0"/>
+        <w:tblLook w:firstColumn="1" w:firstRow="1" w:lastColumn="0" w:lastRow="0" w:noHBand="0" w:noVBand="1" w:val="04A0"/>
+      </w:tblPr>
+      <w:tblGrid>
+        <w:gridCol w:w="2409"/>
+        <w:gridCol w:w="2409"/>
+        <w:gridCol w:w="2409"/>
+        <w:gridCol w:w="2409"/>
+      </w:tblGrid>
+      <w:tr>
+        <w:tc>
+          <w:tcPr>
+            <w:tcW w:type="dxa" w:w="2409"/>
+          </w:tcPr>
+          <w:p>
+            <w:r/>
+            <w:r>
+              <w:t>llll@{}}</w:t>
+              <w:br/>
+              <w:br/>
+              <w:t>Quelle</w:t>
+            </w:r>
+          </w:p>
+        </w:tc>
+        <w:tc>
+          <w:tcPr>
+            <w:tcW w:type="dxa" w:w="2409"/>
+          </w:tcPr>
+          <w:p>
+            <w:r/>
+            <w:r>
+              <w:t>Tabelle</w:t>
+            </w:r>
+          </w:p>
+        </w:tc>
+        <w:tc>
+          <w:tcPr>
+            <w:tcW w:type="dxa" w:w="2409"/>
+          </w:tcPr>
+          <w:p>
+            <w:r/>
+            <w:r>
+              <w:t>Umfang</w:t>
+            </w:r>
+          </w:p>
+        </w:tc>
+        <w:tc>
+          <w:tcPr>
+            <w:tcW w:type="dxa" w:w="2409"/>
+          </w:tcPr>
+          <w:p>
+            <w:r/>
+            <w:r>
+              <w:t>Rolle / Einschränkung</w:t>
+            </w:r>
+          </w:p>
+        </w:tc>
+      </w:tr>
+      <w:tr>
+        <w:tc>
+          <w:tcPr>
+            <w:tcW w:type="dxa" w:w="2409"/>
+          </w:tcPr>
+          <w:p>
+            <w:r/>
+            <w:r>
+              <w:t>Polymarket CLOB/Gamma</w:t>
+            </w:r>
+          </w:p>
+        </w:tc>
+        <w:tc>
+          <w:tcPr>
+            <w:tcW w:type="dxa" w:w="2409"/>
+          </w:tcPr>
+          <w:p>
+            <w:r/>
+            <w:r>
+              <w:rPr>
+                <w:b w:val="0"/>
+                <w:i/>
+              </w:rPr>
+              <w:t>polymarket_prices</w:t>
+            </w:r>
+          </w:p>
+        </w:tc>
+        <w:tc>
+          <w:tcPr>
+            <w:tcW w:type="dxa" w:w="2409"/>
+          </w:tcPr>
+          <w:p>
+            <w:r/>
+            <w:r>
+              <w:t>307 Tagespreise</w:t>
+            </w:r>
+          </w:p>
+        </w:tc>
+        <w:tc>
+          <w:tcPr>
+            <w:tcW w:type="dxa" w:w="2409"/>
+          </w:tcPr>
+          <w:p>
+            <w:r/>
+            <w:r>
+              <w:t>primäre Marktzeitreihe</w:t>
+            </w:r>
+          </w:p>
+        </w:tc>
+      </w:tr>
+      <w:tr>
+        <w:tc>
+          <w:tcPr>
+            <w:tcW w:type="dxa" w:w="2409"/>
+          </w:tcPr>
+          <w:p>
+            <w:r/>
+            <w:r>
+              <w:t>FiveThirtyEight</w:t>
+            </w:r>
+          </w:p>
+        </w:tc>
+        <w:tc>
+          <w:tcPr>
+            <w:tcW w:type="dxa" w:w="2409"/>
+          </w:tcPr>
+          <w:p>
+            <w:r/>
+            <w:r>
+              <w:rPr>
+                <w:b w:val="0"/>
+                <w:i/>
+              </w:rPr>
+              <w:t>poll_forecasts</w:t>
+            </w:r>
+          </w:p>
+        </w:tc>
+        <w:tc>
+          <w:tcPr>
+            <w:tcW w:type="dxa" w:w="2409"/>
+          </w:tcPr>
+          <w:p>
+            <w:r/>
+            <w:r>
+              <w:t>245 Zeilen</w:t>
+            </w:r>
+          </w:p>
+        </w:tc>
+        <w:tc>
+          <w:tcPr>
+            <w:tcW w:type="dxa" w:w="2409"/>
+          </w:tcPr>
+          <w:p>
+            <w:r/>
+            <w:r>
+              <w:t>Vergleichsquelle H1</w:t>
+            </w:r>
+          </w:p>
+        </w:tc>
+      </w:tr>
+      <w:tr>
+        <w:tc>
+          <w:tcPr>
+            <w:tcW w:type="dxa" w:w="2409"/>
+          </w:tcPr>
+          <w:p>
+            <w:r/>
+            <w:r>
+              <w:t>RealClearPolitics</w:t>
+            </w:r>
+          </w:p>
+        </w:tc>
+        <w:tc>
+          <w:tcPr>
+            <w:tcW w:type="dxa" w:w="2409"/>
+          </w:tcPr>
+          <w:p>
+            <w:r/>
+            <w:r>
+              <w:rPr>
+                <w:b w:val="0"/>
+                <w:i/>
+              </w:rPr>
+              <w:t>poll_forecasts</w:t>
+            </w:r>
+          </w:p>
+        </w:tc>
+        <w:tc>
+          <w:tcPr>
+            <w:tcW w:type="dxa" w:w="2409"/>
+          </w:tcPr>
+          <w:p>
+            <w:r/>
+            <w:r>
+              <w:t>0 Zeilen</w:t>
+            </w:r>
+          </w:p>
+        </w:tc>
+        <w:tc>
+          <w:tcPr>
+            <w:tcW w:type="dxa" w:w="2409"/>
+          </w:tcPr>
+          <w:p>
+            <w:r/>
+            <w:r>
+              <w:t>standardmässig ausgeschlossen</w:t>
+            </w:r>
+          </w:p>
+        </w:tc>
+      </w:tr>
+      <w:tr>
+        <w:tc>
+          <w:tcPr>
+            <w:tcW w:type="dxa" w:w="2409"/>
+          </w:tcPr>
+          <w:p>
+            <w:r/>
+            <w:r>
+              <w:t>On-Chain-Wallets</w:t>
+            </w:r>
+          </w:p>
+        </w:tc>
+        <w:tc>
+          <w:tcPr>
+            <w:tcW w:type="dxa" w:w="2409"/>
+          </w:tcPr>
+          <w:p>
+            <w:r/>
+            <w:r>
+              <w:rPr>
+                <w:b w:val="0"/>
+                <w:i/>
+              </w:rPr>
+              <w:t>whale_trades</w:t>
+            </w:r>
+          </w:p>
+        </w:tc>
+        <w:tc>
+          <w:tcPr>
+            <w:tcW w:type="dxa" w:w="2409"/>
+          </w:tcPr>
+          <w:p>
+            <w:r/>
+            <w:r>
+              <w:t>25 113 Zeilen</w:t>
+            </w:r>
+          </w:p>
+        </w:tc>
+        <w:tc>
+          <w:tcPr>
+            <w:tcW w:type="dxa" w:w="2409"/>
+          </w:tcPr>
+          <w:p>
+            <w:r/>
+            <w:r>
+              <w:t>H3, BUY-only, Filter ≥10 000 USD</w:t>
+            </w:r>
+          </w:p>
+        </w:tc>
+      </w:tr>
+      <w:tr>
+        <w:tc>
+          <w:tcPr>
+            <w:tcW w:type="dxa" w:w="2409"/>
+          </w:tcPr>
+          <w:p>
+            <w:r/>
+            <w:r>
+              <w:t>GDELT</w:t>
+            </w:r>
+          </w:p>
+        </w:tc>
+        <w:tc>
+          <w:tcPr>
+            <w:tcW w:type="dxa" w:w="2409"/>
+          </w:tcPr>
+          <w:p>
+            <w:r/>
+            <w:r>
+              <w:rPr>
+                <w:b w:val="0"/>
+                <w:i/>
+              </w:rPr>
+              <w:t>sentiment_scores</w:t>
+            </w:r>
+          </w:p>
+        </w:tc>
+        <w:tc>
+          <w:tcPr>
+            <w:tcW w:type="dxa" w:w="2409"/>
+          </w:tcPr>
+          <w:p>
+            <w:r/>
+            <w:r>
+              <w:t>310 Zeilen</w:t>
+            </w:r>
+          </w:p>
+        </w:tc>
+        <w:tc>
+          <w:tcPr>
+            <w:tcW w:type="dxa" w:w="2409"/>
+          </w:tcPr>
+          <w:p>
+            <w:r/>
+            <w:r>
+              <w:t>Kontext, kein Kernparameter</w:t>
+            </w:r>
+          </w:p>
+        </w:tc>
+      </w:tr>
+      <w:tr>
+        <w:tc>
+          <w:tcPr>
+            <w:tcW w:type="dxa" w:w="2409"/>
+          </w:tcPr>
+          <w:p>
+            <w:r/>
+            <w:r>
+              <w:t>Ereigniskatalog (Seed)</w:t>
+            </w:r>
+          </w:p>
+        </w:tc>
+        <w:tc>
+          <w:tcPr>
+            <w:tcW w:type="dxa" w:w="2409"/>
+          </w:tcPr>
+          <w:p>
+            <w:r/>
+            <w:r>
+              <w:rPr>
+                <w:b w:val="0"/>
+                <w:i/>
+              </w:rPr>
+              <w:t>events_timeline</w:t>
+            </w:r>
+          </w:p>
+        </w:tc>
+        <w:tc>
+          <w:tcPr>
+            <w:tcW w:type="dxa" w:w="2409"/>
+          </w:tcPr>
+          <w:p>
+            <w:r/>
+            <w:r>
+              <w:t>7 kuratierte Ereignisse</w:t>
+            </w:r>
+          </w:p>
+        </w:tc>
+        <w:tc>
+          <w:tcPr>
+            <w:tcW w:type="dxa" w:w="2409"/>
+          </w:tcPr>
+          <w:p>
+            <w:r/>
+            <w:r>
+              <w:t>H2-Eingabe, vorab fixiert</w:t>
+            </w:r>
+          </w:p>
+        </w:tc>
+      </w:tr>
+    </w:tbl>
+    <w:p>
+      <w:pPr>
+        <w:pStyle w:val="Beschriftung"/>
+      </w:pPr>
+      <w:r>
+        <w:t>Daten- und Quelleninventar (T1)</w:t>
+      </w:r>
+    </w:p>
+    <w:p>
+      <w:pPr/>
+      <w:r>
+        <w:t>Die Vergleichsquellen sind bewusst restriktiv gewählt. FiveThirtyEight liefert native Wahrscheinlichkeiten und ist deshalb direkt vergleichbar (Cutting et al., 2025). RealClearPolitics liefert Umfragedurchschnitte, keine Prognosewahrscheinlichkeiten, diese Quelle bleibt aus allen Wahrscheinlichkeits- und Kalibrierungsmetriken ausgeschlossen, solange die in der Methodiknote (</w:t>
+      </w:r>
+      <w:r>
+        <w:rPr>
+          <w:b w:val="0"/>
+          <w:i/>
+        </w:rPr>
+        <w:t>docs/research/RCP_TRANSFORMATION.md</w:t>
+      </w:r>
+      <w:r>
+        <w:t>) beschriebene Logit-Transformation nicht freigegeben ist. Die Wallet-Daten tragen die methodisch wichtigste Datenlimitation: Sie enthalten nur Kauftransaktionen und sind quellseitig ab 10 000 USD gefiltert, beides bleibt Metadaten-Eigenschaft der Rohquelle und ist keine analytische Schwellendefinition.</w:t>
+      </w:r>
+    </w:p>
+    <w:p>
+      <w:pPr>
+        <w:pStyle w:val="berschrift2"/>
+      </w:pPr>
+      <w:r>
+        <w:t>Operationalisierung der Hypothesen</w:t>
+      </w:r>
+    </w:p>
+    <w:p>
+      <w:pPr>
+        <w:pStyle w:val="berschrift3"/>
+      </w:pPr>
+      <w:r>
+        <w:rPr>
+          <w:b/>
+        </w:rPr>
+        <w:t>H1 – Prognosequalität</w:t>
+      </w:r>
+    </w:p>
+    <w:p>
+      <w:pPr/>
+      <w:r>
+        <w:t>H1 bewertet, ob Polymarket im überlappenden Vergleichsfenster bessere Prognosequalität zeigt als vergleichbare traditionelle Wahrscheinlichkeitsprognosen. Als Verlustmass dient der Brier-Score (Brier, 1950), der paarweise Vergleich der Verlustreihen erfolgt mit dem Diebold-Mariano-Test (Diebold &amp; Mariano, 1995), ergänzt um Kalibrierungsdiagnostik, soweit Stichprobengrösse und Methodik es zulassen. Erlaubt ist ausschliesslich die Aussage eines Prognosequalitäts-Vergleichs, ein Beweis höherer Reaktionsgeschwindigkeit, eine allgemeine Marktüberlegenheit oder eine RCP-Wahrscheinlichkeitsaussage ohne dokumentierte Transformation sind ausgeschlossen.</w:t>
+      </w:r>
+    </w:p>
+    <w:p>
+      <w:pPr>
+        <w:pStyle w:val="berschrift3"/>
+      </w:pPr>
+      <w:r>
+        <w:rPr>
+          <w:b/>
+        </w:rPr>
+        <w:t>H2 – Ereignisfenster</w:t>
+      </w:r>
+    </w:p>
+    <w:p>
+      <w:pPr/>
+      <w:r>
+        <w:t>H2 prüft, ob sich Polymarket-Wahrscheinlichkeiten um vorab kuratierte öffentliche Ereignisse in plausibler Richtung und innerhalb fester Tagesfenster bewegen. Die Ereignisse werden vor der Analyse mit Zeitstempel, Quelle und erwarteter Richtung fixiert und nach Sichtung der Marktreaktion weder hinzugefügt noch entfernt. Das Design folgt der Ereignisstudien-Methodik (MacKinlay, 1997). Erlaubt ist die Aussage einer täglichen Ereignisfenster-Reaktion, ein Intraday-Geschwindigkeitsanspruch oder eine nachträgliche Ereignisauswahl sind ausgeschlossen.</w:t>
+      </w:r>
+    </w:p>
+    <w:p>
+      <w:pPr>
+        <w:pStyle w:val="berschrift3"/>
+      </w:pPr>
+      <w:r>
+        <w:rPr>
+          <w:b/>
+        </w:rPr>
+        <w:t>H3 – Wallet-Timing</w:t>
+      </w:r>
+    </w:p>
+    <w:p>
+      <w:pPr/>
+      <w:r>
+        <w:t>H3 untersucht, ob dataset-relative Wallet-Tiers zeitliche Aktivitätsmuster vor oder um Polymarket-Preisbewegungen zeigen. Die Tiers werden nicht über eine willkürliche USD-Schwelle definiert, sondern aus den beobachteten kumulierten Betragsperzentilen der Wallet-Verteilung abgeleitet. Die Diagnostik kombiniert deskriptive Lead-Time-Histogramme, Lead-Lag-Korrelationen und Granger-Tests (Granger, 1969). Die Granger-Ausgaben werden als prädiktive Timing-Diagnostik unter Modellannahmen gelesen, nicht als Kausalitätsbeweis, die Vorsicht gegenüber Insider-Interpretationen stützt sich auf Hanson (2007). Ausgeschlossen bleiben Aussagen zu Kausalität, privater Information, Fehlverhalten oder Profitabilität.</w:t>
+      </w:r>
+    </w:p>
+    <w:p>
+      <w:pPr>
+        <w:pStyle w:val="berschrift2"/>
+      </w:pPr>
+      <w:r>
+        <w:t>Reproduzierbarkeit und Guardrails</w:t>
+      </w:r>
+    </w:p>
+    <w:p>
+      <w:pPr/>
+      <w:r>
+        <w:t xml:space="preserve">Quelldaten liegen portabel in SQLite, analytische Abfragen nutzen zusätzlich DuckDB. Jede Datenbankschreiboperation wird, wo sinnvoll, validiert (pydantic/pandera). Der deterministische Kern ist getestet: zum Stand dieses Entwurfs bestehen 640 Tests. Der Datenzugriff für spätere Interpretationsschichten ist begrenzt (kein </w:t>
+      </w:r>
+      <w:r>
+        <w:rPr>
+          <w:b w:val="0"/>
+          <w:i/>
+        </w:rPr>
+        <w:t>SELECT *</w:t>
+      </w:r>
+      <w:r>
+        <w:t xml:space="preserve"> ohne </w:t>
+      </w:r>
+      <w:r>
+        <w:rPr>
+          <w:b w:val="0"/>
+          <w:i/>
+        </w:rPr>
+        <w:t>LIMIT</w:t>
+      </w:r>
+      <w:r>
+        <w:t>, maximal 50 Zeilen pro Abfrage), und jeder spätere Sprachmodell-Aufruf muss protokolliert werden. Diese Disziplin macht jede thesis-relevante Kennzahl rerunnbar und prüfbar und ist damit selbst ein methodischer Beitrag.</w:t>
       </w:r>
     </w:p>
     <w:p>
@@ -3699,13 +4225,474 @@
         <w:pStyle w:val="berschrift1"/>
       </w:pPr>
       <w:r>
-        <w:t>Daten und Methodik</w:t>
+        <w:t>H1: Prognosequalität</w:t>
       </w:r>
     </w:p>
     <w:p>
       <w:pPr/>
       <w:r>
-        <w:t>[Inhalt folgt – wird im selben Stil ausgeschrieben wie Kapitel 1 und 2.]</w:t>
+        <w:t>H1 prüft, ob Polymarket bessere Prognosequalität zeigt als vergleichbare traditionelle Wahrscheinlichkeitsprognosen, gemessen über den Brier-Verlust (Brier, 1950) und den Diebold-Mariano-Vergleich der Verlustreihen (Diebold &amp; Mariano, 1995; Cutting et al., 2025). Das Ergebnis ist zweigeteilt: begrenzte Stützung in einem klar definierten Vergleichsscope, aber kein Beweis einer breiten Überlegenheit.</w:t>
+      </w:r>
+    </w:p>
+    <w:p>
+      <w:pPr>
+        <w:pStyle w:val="berschrift3"/>
+      </w:pPr>
+      <w:r>
+        <w:rPr>
+          <w:b/>
+        </w:rPr>
+        <w:t>Begrenzte Stützung.</w:t>
+      </w:r>
+    </w:p>
+    <w:p>
+      <w:pPr/>
+      <w:r>
+        <w:t>Im primären Scope – Prognosehorizont ≤90 Tage und geringe bis mittlere Poll-Distanz – hat Polymarket in 262 von 285 State-Date-Zeilen (91.9%) den niedrigeren Brier-Verlust. Behandelt man jeden Bundesstaat als diagnostische Einheit, stützen 9 von 9 States Polymarket (exakter einseitiger Binomialtest p = 0.0020). Abbildung fasst diesen Befund über die Verlustreihen zusammen und zeigt, in wie vielen direkten Vergleichen Polymarket den tieferen Verlust trägt.</w:t>
+      </w:r>
+    </w:p>
+    <w:p>
+      <w:pPr>
+        <w:jc w:val="center"/>
+      </w:pPr>
+      <w:r>
+        <w:drawing>
+          <wp:inline xmlns:a="http://schemas.openxmlformats.org/drawingml/2006/main" xmlns:pic="http://schemas.openxmlformats.org/drawingml/2006/picture">
+            <wp:extent cx="5212080" cy="3316778"/>
+            <wp:docPr id="1" name="Picture 1"/>
+            <wp:cNvGraphicFramePr>
+              <a:graphicFrameLocks noChangeAspect="1"/>
+            </wp:cNvGraphicFramePr>
+            <a:graphic>
+              <a:graphicData uri="http://schemas.openxmlformats.org/drawingml/2006/picture">
+                <pic:pic>
+                  <pic:nvPicPr>
+                    <pic:cNvPr id="0" name="h1_forecast_quality.png"/>
+                    <pic:cNvPicPr/>
+                  </pic:nvPicPr>
+                  <pic:blipFill>
+                    <a:blip r:embed="rId28"/>
+                    <a:stretch>
+                      <a:fillRect/>
+                    </a:stretch>
+                  </pic:blipFill>
+                  <pic:spPr>
+                    <a:xfrm>
+                      <a:off x="0" y="0"/>
+                      <a:ext cx="5212080" cy="3316778"/>
+                    </a:xfrm>
+                    <a:prstGeom prst="rect"/>
+                  </pic:spPr>
+                </pic:pic>
+              </a:graphicData>
+            </a:graphic>
+          </wp:inline>
+        </w:drawing>
+      </w:r>
+    </w:p>
+    <w:p>
+      <w:pPr>
+        <w:pStyle w:val="Beschriftung"/>
+      </w:pPr>
+      <w:r>
+        <w:t>H1-Prognosequalität: Brier-Verlust von Polymarket gegen traditionelle</w:t>
+        <w:br/>
+        <w:t>Vergleichsquellen, Head-to-Head-Zählung und kumulativer Verlustvorteil. Quelle:</w:t>
+        <w:br/>
+      </w:r>
+      <w:r>
+        <w:rPr>
+          <w:b w:val="0"/>
+          <w:i/>
+        </w:rPr>
+        <w:t>data/results/h1_forecast_quality.png</w:t>
+      </w:r>
+      <w:r>
+        <w:t>.</w:t>
+      </w:r>
+    </w:p>
+    <w:p>
+      <w:pPr>
+        <w:pStyle w:val="berschrift3"/>
+      </w:pPr>
+      <w:r>
+        <w:rPr>
+          <w:b/>
+        </w:rPr>
+        <w:t>Lesart der Abbildung.</w:t>
+      </w:r>
+    </w:p>
+    <w:p>
+      <w:pPr/>
+      <w:r>
+        <w:t>Die Abbildung übersetzt den Befund in drei Ansichten: den paarweisen Brier-Verlust von Polymarket gegen die Vergleichsquellen, die Head-to-Head-Zählung der Vergleiche mit tieferem Verlust und den kumulierten Verlustvorteil über die Zeit. Die Head-to-Head-Zählung macht sichtbar, dass der Vorteil breit über die 285 Zeilen verteilt ist und nicht von wenigen Ausreissern stammt, während der kumulierte Verlauf zeigt, ob er anhält. Weil der Brier-Score eine strikt-proper Scoring Rule ist (Gneiting &amp; Raftery, 2007), lässt sich der tiefere Verlust als bessere, ehrlich kalibrierte Wahrscheinlichkeit und nicht als blosses Skalenartefakt lesen. Das Muster reiht sich in die Markt-vs-Umfrage-Evidenz etablierter Prognosemärkte ein (Berg et al., 2008), bleibt aber auf den definierten Scope beschränkt.</w:t>
+      </w:r>
+    </w:p>
+    <w:p>
+      <w:pPr>
+        <w:pStyle w:val="berschrift3"/>
+      </w:pPr>
+      <w:r>
+        <w:rPr>
+          <w:b/>
+        </w:rPr>
+        <w:t>Breite Behauptung nicht bewiesen.</w:t>
+      </w:r>
+    </w:p>
+    <w:p>
+      <w:pPr/>
+      <w:r>
+        <w:t>Über die gesamte Evidenz bleibt die allgemeine Überlegenheit ungedeckt. Von neun Aggregat-Vergleichszeilen stützen sieben Polymarket im mittleren Brier-Verlust, aber nur drei nach Fallmehrheit, und keine einzige beweist die breite Mehr-Fälle-Behauptung. Fünf Audit-Zeilen widersprechen der starken Aussage. Das volle State-Date-Panel ist ein Gegenbeispiel: dort haben die poll-abgeleiteten Wahrscheinlichkeiten in 1360 von 1720 Zeilen den niedrigeren Verlust. Tabelle und Abbildung halten gestützten Scope und Gegenbeispiele nebeneinander.</w:t>
+      </w:r>
+    </w:p>
+    <w:tbl>
+      <w:tblPr>
+        <w:tblStyle w:val="Tabellenraster"/>
+        <w:tblW w:type="auto" w:w="0"/>
+        <w:tblLook w:firstColumn="1" w:firstRow="1" w:lastColumn="0" w:lastRow="0" w:noHBand="0" w:noVBand="1" w:val="04A0"/>
+      </w:tblPr>
+      <w:tblGrid>
+        <w:gridCol w:w="3213"/>
+        <w:gridCol w:w="3213"/>
+        <w:gridCol w:w="3213"/>
+      </w:tblGrid>
+      <w:tr>
+        <w:tc>
+          <w:tcPr>
+            <w:tcW w:type="dxa" w:w="3213"/>
+          </w:tcPr>
+          <w:p>
+            <w:r/>
+            <w:r>
+              <w:t>lll@{}}</w:t>
+              <w:br/>
+              <w:br/>
+              <w:t>Vergleichsscope</w:t>
+            </w:r>
+          </w:p>
+        </w:tc>
+        <w:tc>
+          <w:tcPr>
+            <w:tcW w:type="dxa" w:w="3213"/>
+          </w:tcPr>
+          <w:p>
+            <w:r/>
+            <w:r>
+              <w:t>Polymarket-Stützung</w:t>
+            </w:r>
+          </w:p>
+        </w:tc>
+        <w:tc>
+          <w:tcPr>
+            <w:tcW w:type="dxa" w:w="3213"/>
+          </w:tcPr>
+          <w:p>
+            <w:r/>
+            <w:r>
+              <w:t>Kennzahl</w:t>
+            </w:r>
+          </w:p>
+        </w:tc>
+      </w:tr>
+      <w:tr>
+        <w:tc>
+          <w:tcPr>
+            <w:tcW w:type="dxa" w:w="3213"/>
+          </w:tcPr>
+          <w:p>
+            <w:r/>
+            <w:r>
+              <w:t>≤90 Tage, geringe/mittlere Poll-Distanz</w:t>
+            </w:r>
+          </w:p>
+        </w:tc>
+        <w:tc>
+          <w:tcPr>
+            <w:tcW w:type="dxa" w:w="3213"/>
+          </w:tcPr>
+          <w:p>
+            <w:r/>
+            <w:r>
+              <w:t>ja (begrenzt)</w:t>
+            </w:r>
+          </w:p>
+        </w:tc>
+        <w:tc>
+          <w:tcPr>
+            <w:tcW w:type="dxa" w:w="3213"/>
+          </w:tcPr>
+          <w:p>
+            <w:r/>
+            <w:r>
+              <w:t>262/285 Zeilen (91.9%), 9/9 States, p=0.0020</w:t>
+            </w:r>
+          </w:p>
+        </w:tc>
+      </w:tr>
+      <w:tr>
+        <w:tc>
+          <w:tcPr>
+            <w:tcW w:type="dxa" w:w="3213"/>
+          </w:tcPr>
+          <w:p>
+            <w:r/>
+            <w:r>
+              <w:t>Volles State-Date-Panel</w:t>
+            </w:r>
+          </w:p>
+        </w:tc>
+        <w:tc>
+          <w:tcPr>
+            <w:tcW w:type="dxa" w:w="3213"/>
+          </w:tcPr>
+          <w:p>
+            <w:r/>
+            <w:r>
+              <w:t>nein (Gegenbeispiel)</w:t>
+            </w:r>
+          </w:p>
+        </w:tc>
+        <w:tc>
+          <w:tcPr>
+            <w:tcW w:type="dxa" w:w="3213"/>
+          </w:tcPr>
+          <w:p>
+            <w:r/>
+            <w:r>
+              <w:t>poll-abgeleitet 1360/1720 Zeilen niedriger</w:t>
+            </w:r>
+          </w:p>
+        </w:tc>
+      </w:tr>
+      <w:tr>
+        <w:tc>
+          <w:tcPr>
+            <w:tcW w:type="dxa" w:w="3213"/>
+          </w:tcPr>
+          <w:p>
+            <w:r/>
+            <w:r>
+              <w:t>Breite Mehr-Fälle-Behauptung</w:t>
+            </w:r>
+          </w:p>
+        </w:tc>
+        <w:tc>
+          <w:tcPr>
+            <w:tcW w:type="dxa" w:w="3213"/>
+          </w:tcPr>
+          <w:p>
+            <w:r/>
+            <w:r>
+              <w:t>nicht bewiesen</w:t>
+            </w:r>
+          </w:p>
+        </w:tc>
+        <w:tc>
+          <w:tcPr>
+            <w:tcW w:type="dxa" w:w="3213"/>
+          </w:tcPr>
+          <w:p>
+            <w:r/>
+            <w:r>
+              <w:t>0/9 Broad-Zeilen, 5 Audit-Zeilen dagegen</w:t>
+            </w:r>
+          </w:p>
+        </w:tc>
+      </w:tr>
+    </w:tbl>
+    <w:p>
+      <w:pPr>
+        <w:pStyle w:val="Beschriftung"/>
+      </w:pPr>
+      <w:r>
+        <w:t>H1 – Prognosequalität und Poll-Vergleich (T2)</w:t>
+      </w:r>
+    </w:p>
+    <w:p>
+      <w:pPr>
+        <w:jc w:val="center"/>
+      </w:pPr>
+      <w:r>
+        <w:drawing>
+          <wp:inline xmlns:a="http://schemas.openxmlformats.org/drawingml/2006/main" xmlns:pic="http://schemas.openxmlformats.org/drawingml/2006/picture">
+            <wp:extent cx="5212080" cy="3232809"/>
+            <wp:docPr id="2" name="Picture 2"/>
+            <wp:cNvGraphicFramePr>
+              <a:graphicFrameLocks noChangeAspect="1"/>
+            </wp:cNvGraphicFramePr>
+            <a:graphic>
+              <a:graphicData uri="http://schemas.openxmlformats.org/drawingml/2006/picture">
+                <pic:pic>
+                  <pic:nvPicPr>
+                    <pic:cNvPr id="0" name="h1_poll_claim_readiness.png"/>
+                    <pic:cNvPicPr/>
+                  </pic:nvPicPr>
+                  <pic:blipFill>
+                    <a:blip r:embed="rId29"/>
+                    <a:stretch>
+                      <a:fillRect/>
+                    </a:stretch>
+                  </pic:blipFill>
+                  <pic:spPr>
+                    <a:xfrm>
+                      <a:off x="0" y="0"/>
+                      <a:ext cx="5212080" cy="3232809"/>
+                    </a:xfrm>
+                    <a:prstGeom prst="rect"/>
+                  </pic:spPr>
+                </pic:pic>
+              </a:graphicData>
+            </a:graphic>
+          </wp:inline>
+        </w:drawing>
+      </w:r>
+    </w:p>
+    <w:p>
+      <w:pPr>
+        <w:pStyle w:val="Beschriftung"/>
+      </w:pPr>
+      <w:r>
+        <w:t>Claim-Readiness des H1-Poll-Vergleichs: gestützter Scope gegen</w:t>
+        <w:br/>
+        <w:t xml:space="preserve">Gegenbeispiel-Scopes. Quelle: </w:t>
+      </w:r>
+      <w:r>
+        <w:rPr>
+          <w:b w:val="0"/>
+          <w:i/>
+        </w:rPr>
+        <w:t>data/results/h1_poll_claim_readiness.png</w:t>
+      </w:r>
+      <w:r>
+        <w:t>.</w:t>
+      </w:r>
+    </w:p>
+    <w:p>
+      <w:pPr>
+        <w:pStyle w:val="berschrift3"/>
+      </w:pPr>
+      <w:r>
+        <w:rPr>
+          <w:b/>
+        </w:rPr>
+        <w:t>Lesart der Abbildung.</w:t>
+      </w:r>
+    </w:p>
+    <w:p>
+      <w:pPr/>
+      <w:r>
+        <w:t>Abbildung stellt den gestützten Scope den Gegenbeispiel-Scopes gegenüber und macht damit die Kernbotschaft von H1 sichtbar: Der Polymarket-Vorteil ist real, aber an Bedingungen gebunden (kurzer Horizont, geringe Poll-Distanz). Im vollen Panel kehrt sich das Bild um. Die Abbildung dient so als Claim-Readiness-Prüfung, die die belegbare enge Aussage von der nicht belegbaren breiten Behauptung trennt. Diese Scope-Abhängigkeit deckt sich mit der gemischten, plattformübergreifenden Evidenz für 2024, in der Marktüberlegenheit nicht durchgängig auftrat (Clinton &amp; Huang, 2025).</w:t>
+      </w:r>
+    </w:p>
+    <w:p>
+      <w:pPr>
+        <w:pStyle w:val="berschrift3"/>
+      </w:pPr>
+      <w:r>
+        <w:rPr>
+          <w:b/>
+        </w:rPr>
+        <w:t>Kalibrierung.</w:t>
+      </w:r>
+    </w:p>
+    <w:p>
+      <w:pPr/>
+      <w:r>
+        <w:t>Die Kalibrierungsdiagnostik in Abbildung ergänzt den reinen Verlustvergleich. Über 192 aufgelöste Forecast-Fälle aus sieben Quellen ergeben sich fünf paarweise Vergleiche. Alle fünf stützen Polymarket im mittleren Brier-Verlust, aber nur zwei nach Fallmehrheit. Das bestätigt das zweigeteilte Bild: Polymarket ist im Mittel besser kalibriert, ohne in jedem Einzelfall zu führen.</w:t>
+      </w:r>
+    </w:p>
+    <w:p>
+      <w:pPr>
+        <w:jc w:val="center"/>
+      </w:pPr>
+      <w:r>
+        <w:drawing>
+          <wp:inline xmlns:a="http://schemas.openxmlformats.org/drawingml/2006/main" xmlns:pic="http://schemas.openxmlformats.org/drawingml/2006/picture">
+            <wp:extent cx="5212080" cy="3474720"/>
+            <wp:docPr id="3" name="Picture 3"/>
+            <wp:cNvGraphicFramePr>
+              <a:graphicFrameLocks noChangeAspect="1"/>
+            </wp:cNvGraphicFramePr>
+            <a:graphic>
+              <a:graphicData uri="http://schemas.openxmlformats.org/drawingml/2006/picture">
+                <pic:pic>
+                  <pic:nvPicPr>
+                    <pic:cNvPr id="0" name="h1_calibration_diagnostic.png"/>
+                    <pic:cNvPicPr/>
+                  </pic:nvPicPr>
+                  <pic:blipFill>
+                    <a:blip r:embed="rId30"/>
+                    <a:stretch>
+                      <a:fillRect/>
+                    </a:stretch>
+                  </pic:blipFill>
+                  <pic:spPr>
+                    <a:xfrm>
+                      <a:off x="0" y="0"/>
+                      <a:ext cx="5212080" cy="3474720"/>
+                    </a:xfrm>
+                    <a:prstGeom prst="rect"/>
+                  </pic:spPr>
+                </pic:pic>
+              </a:graphicData>
+            </a:graphic>
+          </wp:inline>
+        </w:drawing>
+      </w:r>
+    </w:p>
+    <w:p>
+      <w:pPr>
+        <w:pStyle w:val="Beschriftung"/>
+      </w:pPr>
+      <w:r>
+        <w:t>H1-Kalibrierungsdiagnostik über aufgelöste Forecast-Fälle (Scorecard und</w:t>
+        <w:br/>
+        <w:t>Reliabilitätspunkte für Quellen mit mindestens 30 Fällen). Quelle:</w:t>
+        <w:br/>
+      </w:r>
+      <w:r>
+        <w:rPr>
+          <w:b w:val="0"/>
+          <w:i/>
+        </w:rPr>
+        <w:t>data/results/h1_calibration_diagnostic.png</w:t>
+      </w:r>
+      <w:r>
+        <w:t>.</w:t>
+      </w:r>
+    </w:p>
+    <w:p>
+      <w:pPr>
+        <w:pStyle w:val="berschrift3"/>
+      </w:pPr>
+      <w:r>
+        <w:rPr>
+          <w:b/>
+        </w:rPr>
+        <w:t>Lesart der Abbildung.</w:t>
+      </w:r>
+    </w:p>
+    <w:p>
+      <w:pPr/>
+      <w:r>
+        <w:t>Die Kalibrierungsabbildung kombiniert eine Scorecard der paarweisen Vergleiche mit Reliabilitätspunkten für Quellen mit mindestens 30 Fällen, dargestellt mit gleichem Achsenmassstab, sodass die 45-Grad-Diagonale die perfekte Kalibrierung markiert. Punkte nahe dieser Diagonale stehen für gute Kalibrierung, also prognostizierte nahe beobachteter Häufigkeit. Dass alle fünf paarweisen Vergleiche Polymarket im mittleren Brier stützen, aber nur zwei nach Fallmehrheit, zeigt einen im Mittel besser kalibrierten, jedoch nicht durchgängig führenden Forecast. Das passt zur Mahnung, einen Marktpreis nicht unbesehen mit einer Wahrscheinlichkeit gleichzusetzen (Manski, 2006).</w:t>
+      </w:r>
+    </w:p>
+    <w:p>
+      <w:pPr>
+        <w:pStyle w:val="berschrift3"/>
+      </w:pPr>
+      <w:r>
+        <w:rPr>
+          <w:b/>
+        </w:rPr>
+        <w:t>Limitation.</w:t>
+      </w:r>
+    </w:p>
+    <w:p>
+      <w:pPr/>
+      <w:r>
+        <w:t>Die Evidenz besteht aus wiederholten Tageszeilen innerhalb eines einzelnen Wahlkontexts und ersetzt keine unabhängige Mehr-Wahlen-Stichprobe. Aus H1 folgt kein Beweis höherer Reaktionsgeschwindigkeit, keine universelle Marktüberlegenheit und keine kausale Erklärung. Die finale Zitation der Methodenquellen steht bis zum Abschluss des manuellen Quellen-Reviews aus.</w:t>
       </w:r>
     </w:p>
     <w:p>
@@ -3713,13 +4700,408 @@
         <w:pStyle w:val="berschrift1"/>
       </w:pPr>
       <w:r>
-        <w:t>H1: Prognosequalität</w:t>
+        <w:t>H2: Ereignisfenster</w:t>
       </w:r>
     </w:p>
     <w:p>
       <w:pPr/>
       <w:r>
-        <w:t>[Inhalt folgt – wird im selben Stil ausgeschrieben wie Kapitel 1 und 2.]</w:t>
+        <w:t>H2 prüft, ob sich Polymarket-Wahrscheinlichkeiten um sieben vorab kuratierte öffentliche Ereignisse in plausibler Richtung und innerhalb fester Tagesfenster bewegen (MacKinlay, 1997; Fama, 1970). Die Ereignisse wurden vor der Analyse mit Zeitstempel und erwarteter Richtung fixiert.</w:t>
+      </w:r>
+    </w:p>
+    <w:p>
+      <w:pPr>
+        <w:pStyle w:val="berschrift3"/>
+      </w:pPr>
+      <w:r>
+        <w:rPr>
+          <w:b/>
+        </w:rPr>
+        <w:t>Sichtbare Tagesreaktion.</w:t>
+      </w:r>
+    </w:p>
+    <w:p>
+      <w:pPr/>
+      <w:r>
+        <w:t>Die stärkste Primärfenster-Bewegung (0–1 Tag) zeigt das Attentat auf Trump am 13. Juli 2024 mit einer abnormalen Veränderung von +7.2 Prozentpunkten zugunsten von Trump. Die gerichtet erwarteten Ereignisse bewegen sich konsistent: die Verurteilung im Schweigegeld-Prozess (-4.1 pp) und Bidens Rückzug zugunsten von Harris (-1.7 pp für Trump) gehen in die erwartete Richtung. Die übrigen, als neutral kuratierten Ereignisse zeigen kleinere Bewegungen. Insgesamt reagieren die Polymarket-Wahrscheinlichkeiten auf Tagesebene plausibel auf die kuratierten Ereignisse.</w:t>
+      </w:r>
+    </w:p>
+    <w:tbl>
+      <w:tblPr>
+        <w:tblStyle w:val="Tabellenraster"/>
+        <w:tblW w:type="auto" w:w="0"/>
+        <w:tblLook w:firstColumn="1" w:firstRow="1" w:lastColumn="0" w:lastRow="0" w:noHBand="0" w:noVBand="1" w:val="04A0"/>
+      </w:tblPr>
+      <w:tblGrid>
+        <w:gridCol w:w="3213"/>
+        <w:gridCol w:w="3213"/>
+        <w:gridCol w:w="3213"/>
+      </w:tblGrid>
+      <w:tr>
+        <w:tc>
+          <w:tcPr>
+            <w:tcW w:type="dxa" w:w="3213"/>
+          </w:tcPr>
+          <w:p>
+            <w:r/>
+            <w:r>
+              <w:t>llr@{}}</w:t>
+              <w:br/>
+              <w:br/>
+              <w:t>Ereignis (2024)</w:t>
+            </w:r>
+          </w:p>
+        </w:tc>
+        <w:tc>
+          <w:tcPr>
+            <w:tcW w:type="dxa" w:w="3213"/>
+          </w:tcPr>
+          <w:p>
+            <w:r/>
+            <w:r>
+              <w:t>erwartete Richtung</w:t>
+            </w:r>
+          </w:p>
+        </w:tc>
+        <w:tc>
+          <w:tcPr>
+            <w:tcW w:type="dxa" w:w="3213"/>
+          </w:tcPr>
+          <w:p>
+            <w:r/>
+            <w:r>
+              <w:t>abn. Veränderung (pp)</w:t>
+            </w:r>
+          </w:p>
+        </w:tc>
+      </w:tr>
+      <w:tr>
+        <w:tc>
+          <w:tcPr>
+            <w:tcW w:type="dxa" w:w="3213"/>
+          </w:tcPr>
+          <w:p>
+            <w:r/>
+            <w:r>
+              <w:t>Trump-Verurteilung (30.05.)</w:t>
+            </w:r>
+          </w:p>
+        </w:tc>
+        <w:tc>
+          <w:tcPr>
+            <w:tcW w:type="dxa" w:w="3213"/>
+          </w:tcPr>
+          <w:p>
+            <w:r/>
+            <w:r>
+              <w:t>Trump runter</w:t>
+            </w:r>
+          </w:p>
+        </w:tc>
+        <w:tc>
+          <w:tcPr>
+            <w:tcW w:type="dxa" w:w="3213"/>
+          </w:tcPr>
+          <w:p>
+            <w:r/>
+            <w:r>
+              <w:t>-4.1</w:t>
+            </w:r>
+          </w:p>
+        </w:tc>
+      </w:tr>
+      <w:tr>
+        <w:tc>
+          <w:tcPr>
+            <w:tcW w:type="dxa" w:w="3213"/>
+          </w:tcPr>
+          <w:p>
+            <w:r/>
+            <w:r>
+              <w:t>Biden–Trump-Debatte (28.06.)</w:t>
+            </w:r>
+          </w:p>
+        </w:tc>
+        <w:tc>
+          <w:tcPr>
+            <w:tcW w:type="dxa" w:w="3213"/>
+          </w:tcPr>
+          <w:p>
+            <w:r/>
+            <w:r>
+              <w:t>neutral</w:t>
+            </w:r>
+          </w:p>
+        </w:tc>
+        <w:tc>
+          <w:tcPr>
+            <w:tcW w:type="dxa" w:w="3213"/>
+          </w:tcPr>
+          <w:p>
+            <w:r/>
+            <w:r>
+              <w:t>+2.5</w:t>
+            </w:r>
+          </w:p>
+        </w:tc>
+      </w:tr>
+      <w:tr>
+        <w:tc>
+          <w:tcPr>
+            <w:tcW w:type="dxa" w:w="3213"/>
+          </w:tcPr>
+          <w:p>
+            <w:r/>
+            <w:r>
+              <w:t>Attentat auf Trump (13.07.)</w:t>
+            </w:r>
+          </w:p>
+        </w:tc>
+        <w:tc>
+          <w:tcPr>
+            <w:tcW w:type="dxa" w:w="3213"/>
+          </w:tcPr>
+          <w:p>
+            <w:r/>
+            <w:r>
+              <w:t>Trump rauf</w:t>
+            </w:r>
+          </w:p>
+        </w:tc>
+        <w:tc>
+          <w:tcPr>
+            <w:tcW w:type="dxa" w:w="3213"/>
+          </w:tcPr>
+          <w:p>
+            <w:r/>
+            <w:r>
+              <w:t>+7.2</w:t>
+            </w:r>
+          </w:p>
+        </w:tc>
+      </w:tr>
+      <w:tr>
+        <w:tc>
+          <w:tcPr>
+            <w:tcW w:type="dxa" w:w="3213"/>
+          </w:tcPr>
+          <w:p>
+            <w:r/>
+            <w:r>
+              <w:t>Vance als VP (15.07.)</w:t>
+            </w:r>
+          </w:p>
+        </w:tc>
+        <w:tc>
+          <w:tcPr>
+            <w:tcW w:type="dxa" w:w="3213"/>
+          </w:tcPr>
+          <w:p>
+            <w:r/>
+            <w:r>
+              <w:t>neutral</w:t>
+            </w:r>
+          </w:p>
+        </w:tc>
+        <w:tc>
+          <w:tcPr>
+            <w:tcW w:type="dxa" w:w="3213"/>
+          </w:tcPr>
+          <w:p>
+            <w:r/>
+            <w:r>
+              <w:t>+3.5</w:t>
+            </w:r>
+          </w:p>
+        </w:tc>
+      </w:tr>
+      <w:tr>
+        <w:tc>
+          <w:tcPr>
+            <w:tcW w:type="dxa" w:w="3213"/>
+          </w:tcPr>
+          <w:p>
+            <w:r/>
+            <w:r>
+              <w:t>Biden-Rückzug (21.07.)</w:t>
+            </w:r>
+          </w:p>
+        </w:tc>
+        <w:tc>
+          <w:tcPr>
+            <w:tcW w:type="dxa" w:w="3213"/>
+          </w:tcPr>
+          <w:p>
+            <w:r/>
+            <w:r>
+              <w:t>Harris rauf</w:t>
+            </w:r>
+          </w:p>
+        </w:tc>
+        <w:tc>
+          <w:tcPr>
+            <w:tcW w:type="dxa" w:w="3213"/>
+          </w:tcPr>
+          <w:p>
+            <w:r/>
+            <w:r>
+              <w:t>-1.7</w:t>
+            </w:r>
+          </w:p>
+        </w:tc>
+      </w:tr>
+      <w:tr>
+        <w:tc>
+          <w:tcPr>
+            <w:tcW w:type="dxa" w:w="3213"/>
+          </w:tcPr>
+          <w:p>
+            <w:r/>
+            <w:r>
+              <w:t>Walz als VP (06.08.)</w:t>
+            </w:r>
+          </w:p>
+        </w:tc>
+        <w:tc>
+          <w:tcPr>
+            <w:tcW w:type="dxa" w:w="3213"/>
+          </w:tcPr>
+          <w:p>
+            <w:r/>
+            <w:r>
+              <w:t>neutral</w:t>
+            </w:r>
+          </w:p>
+        </w:tc>
+        <w:tc>
+          <w:tcPr>
+            <w:tcW w:type="dxa" w:w="3213"/>
+          </w:tcPr>
+          <w:p>
+            <w:r/>
+            <w:r>
+              <w:t>+1.3</w:t>
+            </w:r>
+          </w:p>
+        </w:tc>
+      </w:tr>
+      <w:tr>
+        <w:tc>
+          <w:tcPr>
+            <w:tcW w:type="dxa" w:w="3213"/>
+          </w:tcPr>
+          <w:p>
+            <w:r/>
+            <w:r>
+              <w:t>Harris–Trump-Debatte (11.09.)</w:t>
+            </w:r>
+          </w:p>
+        </w:tc>
+        <w:tc>
+          <w:tcPr>
+            <w:tcW w:type="dxa" w:w="3213"/>
+          </w:tcPr>
+          <w:p>
+            <w:r/>
+            <w:r>
+              <w:t>neutral</w:t>
+            </w:r>
+          </w:p>
+        </w:tc>
+        <w:tc>
+          <w:tcPr>
+            <w:tcW w:type="dxa" w:w="3213"/>
+          </w:tcPr>
+          <w:p>
+            <w:r/>
+            <w:r>
+              <w:t>-2.9</w:t>
+            </w:r>
+          </w:p>
+        </w:tc>
+      </w:tr>
+    </w:tbl>
+    <w:p>
+      <w:pPr>
+        <w:pStyle w:val="Beschriftung"/>
+      </w:pPr>
+      <w:r>
+        <w:t>H2 – Abnormale Veränderung im Primärfenster (0–1 Tag) (T3)</w:t>
+      </w:r>
+    </w:p>
+    <w:p>
+      <w:pPr>
+        <w:jc w:val="center"/>
+      </w:pPr>
+      <w:r>
+        <w:drawing>
+          <wp:inline xmlns:a="http://schemas.openxmlformats.org/drawingml/2006/main" xmlns:pic="http://schemas.openxmlformats.org/drawingml/2006/picture">
+            <wp:extent cx="5212080" cy="2606040"/>
+            <wp:docPr id="4" name="Picture 4"/>
+            <wp:cNvGraphicFramePr>
+              <a:graphicFrameLocks noChangeAspect="1"/>
+            </wp:cNvGraphicFramePr>
+            <a:graphic>
+              <a:graphicData uri="http://schemas.openxmlformats.org/drawingml/2006/picture">
+                <pic:pic>
+                  <pic:nvPicPr>
+                    <pic:cNvPr id="0" name="thesis_h2_event_window_car.png"/>
+                    <pic:cNvPicPr/>
+                  </pic:nvPicPr>
+                  <pic:blipFill>
+                    <a:blip r:embed="rId31"/>
+                    <a:stretch>
+                      <a:fillRect/>
+                    </a:stretch>
+                  </pic:blipFill>
+                  <pic:spPr>
+                    <a:xfrm>
+                      <a:off x="0" y="0"/>
+                      <a:ext cx="5212080" cy="2606040"/>
+                    </a:xfrm>
+                    <a:prstGeom prst="rect"/>
+                  </pic:spPr>
+                </pic:pic>
+              </a:graphicData>
+            </a:graphic>
+          </wp:inline>
+        </w:drawing>
+      </w:r>
+    </w:p>
+    <w:p>
+      <w:pPr>
+        <w:pStyle w:val="Beschriftung"/>
+      </w:pPr>
+      <w:r>
+        <w:t>Tägliche Ereignisfenster-Bewegungen (F2). Quelle:</w:t>
+        <w:br/>
+      </w:r>
+      <w:r>
+        <w:rPr>
+          <w:b w:val="0"/>
+          <w:i/>
+        </w:rPr>
+        <w:t>data/results/thesis_h2_event_window_car.png</w:t>
+      </w:r>
+      <w:r>
+        <w:t>.</w:t>
+      </w:r>
+    </w:p>
+    <w:p>
+      <w:pPr>
+        <w:pStyle w:val="berschrift3"/>
+      </w:pPr>
+      <w:r>
+        <w:rPr>
+          <w:b/>
+        </w:rPr>
+        <w:t>Limitation.</w:t>
+      </w:r>
+    </w:p>
+    <w:p>
+      <w:pPr/>
+      <w:r>
+        <w:t>Die Analyse beruht auf Tagespreisen und kann keine Intraday-Reaktionszeit identifizieren, H2 stützt damit eine Aussage über tägliche Reaktionsmuster, nicht über sofortige Marktreaktion. Da die Ereignisse vorab fixiert wurden, besteht keine nachträgliche Auswahl nach sichtbaren Preisbewegungen.</w:t>
       </w:r>
     </w:p>
     <w:p>
@@ -3727,13 +5109,630 @@
         <w:pStyle w:val="berschrift1"/>
       </w:pPr>
       <w:r>
-        <w:t>H2: Ereignisreaktion</w:t>
+        <w:t>H3: Wallet-Timing</w:t>
       </w:r>
     </w:p>
     <w:p>
       <w:pPr/>
       <w:r>
-        <w:t>[Inhalt folgt – wird im selben Stil ausgeschrieben wie Kapitel 1 und 2.]</w:t>
+        <w:t>H3 untersucht, ob dataset-relative Wallet-Tiers zeitliche Aktivitätsmuster vor oder um Polymarket-Preisbewegungen zeigen. Die Tiers werden aus den beobachteten kumulierten Betragsperzentilen der Wallet-Verteilung abgeleitet, nicht über eine willkürliche USD-Schwelle (Tsang &amp; Yang, 2026; Rezabek, 2024). Die Timing-Diagnostik nutzt Lead-Lag-Korrelationen und Granger-Tests (Granger, 1969).</w:t>
+      </w:r>
+    </w:p>
+    <w:p>
+      <w:pPr>
+        <w:pStyle w:val="berschrift3"/>
+      </w:pPr>
+      <w:r>
+        <w:rPr>
+          <w:b/>
+        </w:rPr>
+        <w:t>Wallet-Tiers.</w:t>
+      </w:r>
+    </w:p>
+    <w:p>
+      <w:pPr/>
+      <w:r>
+        <w:t>Abbildung zeigt die verteilungsbasierten Tiers und ihre Besetzung. Das oberste Tier umfasst das oberste eine Prozent der Wallets (32 Adressen im beobachteten, BUY-seitigen Datensatz). Die Tiers sind damit relativ zum Datensatz definiert und tragen keine externe Schwelle.</w:t>
+      </w:r>
+    </w:p>
+    <w:p>
+      <w:pPr>
+        <w:jc w:val="center"/>
+      </w:pPr>
+      <w:r>
+        <w:drawing>
+          <wp:inline xmlns:a="http://schemas.openxmlformats.org/drawingml/2006/main" xmlns:pic="http://schemas.openxmlformats.org/drawingml/2006/picture">
+            <wp:extent cx="5212080" cy="2895600"/>
+            <wp:docPr id="5" name="Picture 5"/>
+            <wp:cNvGraphicFramePr>
+              <a:graphicFrameLocks noChangeAspect="1"/>
+            </wp:cNvGraphicFramePr>
+            <a:graphic>
+              <a:graphicData uri="http://schemas.openxmlformats.org/drawingml/2006/picture">
+                <pic:pic>
+                  <pic:nvPicPr>
+                    <pic:cNvPr id="0" name="thesis_h3_wallet_tier_counts.png"/>
+                    <pic:cNvPicPr/>
+                  </pic:nvPicPr>
+                  <pic:blipFill>
+                    <a:blip r:embed="rId32"/>
+                    <a:stretch>
+                      <a:fillRect/>
+                    </a:stretch>
+                  </pic:blipFill>
+                  <pic:spPr>
+                    <a:xfrm>
+                      <a:off x="0" y="0"/>
+                      <a:ext cx="5212080" cy="2895600"/>
+                    </a:xfrm>
+                    <a:prstGeom prst="rect"/>
+                  </pic:spPr>
+                </pic:pic>
+              </a:graphicData>
+            </a:graphic>
+          </wp:inline>
+        </w:drawing>
+      </w:r>
+    </w:p>
+    <w:p>
+      <w:pPr>
+        <w:pStyle w:val="Beschriftung"/>
+      </w:pPr>
+      <w:r>
+        <w:t>Dataset-relative Wallet-Tiers und ihre Besetzung. Quelle:</w:t>
+        <w:br/>
+      </w:r>
+      <w:r>
+        <w:rPr>
+          <w:b w:val="0"/>
+          <w:i/>
+        </w:rPr>
+        <w:t>data/results/thesis_h3_wallet_tier_counts.png</w:t>
+      </w:r>
+      <w:r>
+        <w:t>.</w:t>
+      </w:r>
+    </w:p>
+    <w:p>
+      <w:pPr>
+        <w:pStyle w:val="berschrift3"/>
+      </w:pPr>
+      <w:r>
+        <w:rPr>
+          <w:b/>
+        </w:rPr>
+        <w:t>Klarstes Muster im obersten Tier.</w:t>
+      </w:r>
+    </w:p>
+    <w:p>
+      <w:pPr/>
+      <w:r>
+        <w:t>Das oberste Tier zeigt die deutlichste deterministische Timing-Struktur: eine Lag-1-Korrelation von 0.186 zwischen Tier-Aktivität und nachfolgenden Preisänderungen und einen minimalen Granger-p-Wert von 0.0012 über 1216 ausgerichtete Tageszeilen (Abbildung). Das ist ein prädiktives Timing-Signal unter den getesteten Modellannahmen, kein Nachweis von Kausalität oder privater Information (Hanson, 2007).</w:t>
+      </w:r>
+    </w:p>
+    <w:p>
+      <w:pPr>
+        <w:jc w:val="center"/>
+      </w:pPr>
+      <w:r>
+        <w:drawing>
+          <wp:inline xmlns:a="http://schemas.openxmlformats.org/drawingml/2006/main" xmlns:pic="http://schemas.openxmlformats.org/drawingml/2006/picture">
+            <wp:extent cx="5212080" cy="2779776"/>
+            <wp:docPr id="6" name="Picture 6"/>
+            <wp:cNvGraphicFramePr>
+              <a:graphicFrameLocks noChangeAspect="1"/>
+            </wp:cNvGraphicFramePr>
+            <a:graphic>
+              <a:graphicData uri="http://schemas.openxmlformats.org/drawingml/2006/picture">
+                <pic:pic>
+                  <pic:nvPicPr>
+                    <pic:cNvPr id="0" name="thesis_h3_granger_pvalues.png"/>
+                    <pic:cNvPicPr/>
+                  </pic:nvPicPr>
+                  <pic:blipFill>
+                    <a:blip r:embed="rId33"/>
+                    <a:stretch>
+                      <a:fillRect/>
+                    </a:stretch>
+                  </pic:blipFill>
+                  <pic:spPr>
+                    <a:xfrm>
+                      <a:off x="0" y="0"/>
+                      <a:ext cx="5212080" cy="2779776"/>
+                    </a:xfrm>
+                    <a:prstGeom prst="rect"/>
+                  </pic:spPr>
+                </pic:pic>
+              </a:graphicData>
+            </a:graphic>
+          </wp:inline>
+        </w:drawing>
+      </w:r>
+    </w:p>
+    <w:p>
+      <w:pPr>
+        <w:pStyle w:val="Beschriftung"/>
+      </w:pPr>
+      <w:r>
+        <w:t>Granger-Diagnostik je Tier (minimale p-Werte). Quelle:</w:t>
+        <w:br/>
+      </w:r>
+      <w:r>
+        <w:rPr>
+          <w:b w:val="0"/>
+          <w:i/>
+        </w:rPr>
+        <w:t>data/results/thesis_h3_granger_pvalues.png</w:t>
+      </w:r>
+      <w:r>
+        <w:t>.</w:t>
+      </w:r>
+    </w:p>
+    <w:p>
+      <w:pPr>
+        <w:pStyle w:val="berschrift3"/>
+      </w:pPr>
+      <w:r>
+        <w:rPr>
+          <w:b/>
+        </w:rPr>
+        <w:t>Deskriptives Lead-Time-Profil.</w:t>
+      </w:r>
+    </w:p>
+    <w:p>
+      <w:pPr/>
+      <w:r>
+        <w:t>Abbildung stellt die Lead-Time der Tier-Aktivität relativ zu ausgewählten Bewegungen dar. Das Profil ist rein deskriptiv und beschreibt, wie sich beobachtete Aktivität zeitlich um Preisänderungen verteilt, ohne eine Wirkungsrichtung zu behaupten.</w:t>
+      </w:r>
+    </w:p>
+    <w:p>
+      <w:pPr>
+        <w:jc w:val="center"/>
+      </w:pPr>
+      <w:r>
+        <w:drawing>
+          <wp:inline xmlns:a="http://schemas.openxmlformats.org/drawingml/2006/main" xmlns:pic="http://schemas.openxmlformats.org/drawingml/2006/picture">
+            <wp:extent cx="5212080" cy="3127248"/>
+            <wp:docPr id="7" name="Picture 7"/>
+            <wp:cNvGraphicFramePr>
+              <a:graphicFrameLocks noChangeAspect="1"/>
+            </wp:cNvGraphicFramePr>
+            <a:graphic>
+              <a:graphicData uri="http://schemas.openxmlformats.org/drawingml/2006/picture">
+                <pic:pic>
+                  <pic:nvPicPr>
+                    <pic:cNvPr id="0" name="thesis_h3_lead_time_amount.png"/>
+                    <pic:cNvPicPr/>
+                  </pic:nvPicPr>
+                  <pic:blipFill>
+                    <a:blip r:embed="rId34"/>
+                    <a:stretch>
+                      <a:fillRect/>
+                    </a:stretch>
+                  </pic:blipFill>
+                  <pic:spPr>
+                    <a:xfrm>
+                      <a:off x="0" y="0"/>
+                      <a:ext cx="5212080" cy="3127248"/>
+                    </a:xfrm>
+                    <a:prstGeom prst="rect"/>
+                  </pic:spPr>
+                </pic:pic>
+              </a:graphicData>
+            </a:graphic>
+          </wp:inline>
+        </w:drawing>
+      </w:r>
+    </w:p>
+    <w:p>
+      <w:pPr>
+        <w:pStyle w:val="Beschriftung"/>
+      </w:pPr>
+      <w:r>
+        <w:t>Deskriptives Lead-Time-Profil der Tier-Aktivität. Quelle:</w:t>
+        <w:br/>
+      </w:r>
+      <w:r>
+        <w:rPr>
+          <w:b w:val="0"/>
+          <w:i/>
+        </w:rPr>
+        <w:t>data/results/thesis_h3_lead_time_amount.png</w:t>
+      </w:r>
+      <w:r>
+        <w:t>.</w:t>
+      </w:r>
+    </w:p>
+    <w:tbl>
+      <w:tblPr>
+        <w:tblStyle w:val="Tabellenraster"/>
+        <w:tblW w:type="auto" w:w="0"/>
+        <w:tblLook w:firstColumn="1" w:firstRow="1" w:lastColumn="0" w:lastRow="0" w:noHBand="0" w:noVBand="1" w:val="04A0"/>
+      </w:tblPr>
+      <w:tblGrid>
+        <w:gridCol w:w="2409"/>
+        <w:gridCol w:w="2409"/>
+        <w:gridCol w:w="2409"/>
+        <w:gridCol w:w="2409"/>
+      </w:tblGrid>
+      <w:tr>
+        <w:tc>
+          <w:tcPr>
+            <w:tcW w:type="dxa" w:w="2409"/>
+          </w:tcPr>
+          <w:p>
+            <w:r/>
+            <w:r>
+              <w:t>lrrr@{}}</w:t>
+              <w:br/>
+              <w:br/>
+              <w:t>Tier</w:t>
+            </w:r>
+          </w:p>
+        </w:tc>
+        <w:tc>
+          <w:tcPr>
+            <w:tcW w:type="dxa" w:w="2409"/>
+          </w:tcPr>
+          <w:p>
+            <w:r/>
+            <w:r>
+              <w:t>Lag-1-Korrelation</w:t>
+            </w:r>
+          </w:p>
+        </w:tc>
+        <w:tc>
+          <w:tcPr>
+            <w:tcW w:type="dxa" w:w="2409"/>
+          </w:tcPr>
+          <w:p>
+            <w:r/>
+            <w:r>
+              <w:t>Granger-p (min)</w:t>
+            </w:r>
+          </w:p>
+        </w:tc>
+        <w:tc>
+          <w:tcPr>
+            <w:tcW w:type="dxa" w:w="2409"/>
+          </w:tcPr>
+          <w:p>
+            <w:r/>
+            <w:r>
+              <w:t>ausgerichtete Zeilen</w:t>
+            </w:r>
+          </w:p>
+        </w:tc>
+      </w:tr>
+      <w:tr>
+        <w:tc>
+          <w:tcPr>
+            <w:tcW w:type="dxa" w:w="2409"/>
+          </w:tcPr>
+          <w:p>
+            <w:r/>
+            <w:r>
+              <w:t>Oberstes 1%-Tier</w:t>
+            </w:r>
+          </w:p>
+        </w:tc>
+        <w:tc>
+          <w:tcPr>
+            <w:tcW w:type="dxa" w:w="2409"/>
+          </w:tcPr>
+          <w:p>
+            <w:r/>
+            <w:r>
+              <w:t>0.186</w:t>
+            </w:r>
+          </w:p>
+        </w:tc>
+        <w:tc>
+          <w:tcPr>
+            <w:tcW w:type="dxa" w:w="2409"/>
+          </w:tcPr>
+          <w:p>
+            <w:r/>
+            <w:r>
+              <w:t>0.0012</w:t>
+            </w:r>
+          </w:p>
+        </w:tc>
+        <w:tc>
+          <w:tcPr>
+            <w:tcW w:type="dxa" w:w="2409"/>
+          </w:tcPr>
+          <w:p>
+            <w:r/>
+            <w:r>
+              <w:t>1216</w:t>
+            </w:r>
+          </w:p>
+        </w:tc>
+      </w:tr>
+    </w:tbl>
+    <w:p>
+      <w:pPr>
+        <w:pStyle w:val="Beschriftung"/>
+      </w:pPr>
+      <w:r>
+        <w:t>H3 – Wallet-Tier-Timing-Diagnostik (T4)</w:t>
+      </w:r>
+    </w:p>
+    <w:p>
+      <w:pPr>
+        <w:pStyle w:val="berschrift2"/>
+      </w:pPr>
+      <w:r>
+        <w:t>Ereignis-Wallet-Anomalien als deskriptive Diagnostik</w:t>
+      </w:r>
+    </w:p>
+    <w:p>
+      <w:pPr/>
+      <w:r>
+        <w:t>Auf derselben Datenbasis prüft eine deterministische Anomalie-Diagnostik, ob sich um die kuratierten Ereignisse auffällige Aktivitäts-, Bewegungs- oder Konzentrationsmuster zeigen. Eine Tagesbeobachtung gilt als auffällig, wenn ihr robuster z-Wert mindestens 2.0 erreicht oder ihr Perzentilrang mindestens 0.95 beträgt, gemessen gegen ein Basisfenster von 30 bis 8 Tagen vor dem Ereignis und ein Ereignisfenster von einem Tag davor bis drei Tage danach. Die Diagnostik betrachtet vier Familien: aktive Wallets je Tier, absolute Marktbewegung, Top-Tier-Konzentration und Tier-Betragssumme.</w:t>
+      </w:r>
+    </w:p>
+    <w:p>
+      <w:pPr/>
+      <w:r>
+        <w:t>Als Beispiel zeigt die Verurteilung im Schweigegeld-Prozess vom 30. Mai 2024 im Basis-Tier eine deutliche Aktiv-Wallet-Auffälligkeit (z = 3.5, Perzentilrang 1.0, zwei auffällige Tage) sowie eine auffällige Marktbewegung (Perzentilrang 0.96, ein Tag). Abbildung fasst über alle sieben Ereignisse zusammen, welche Familien an welchen Ereignissen auffällige Tage aufweisen.</w:t>
+      </w:r>
+    </w:p>
+    <w:p>
+      <w:pPr>
+        <w:jc w:val="center"/>
+      </w:pPr>
+      <w:r>
+        <w:drawing>
+          <wp:inline xmlns:a="http://schemas.openxmlformats.org/drawingml/2006/main" xmlns:pic="http://schemas.openxmlformats.org/drawingml/2006/picture">
+            <wp:extent cx="5212080" cy="2501798"/>
+            <wp:docPr id="8" name="Picture 8"/>
+            <wp:cNvGraphicFramePr>
+              <a:graphicFrameLocks noChangeAspect="1"/>
+            </wp:cNvGraphicFramePr>
+            <a:graphic>
+              <a:graphicData uri="http://schemas.openxmlformats.org/drawingml/2006/picture">
+                <pic:pic>
+                  <pic:nvPicPr>
+                    <pic:cNvPr id="0" name="thesis_h3_event_wallet_anomalies.png"/>
+                    <pic:cNvPicPr/>
+                  </pic:nvPicPr>
+                  <pic:blipFill>
+                    <a:blip r:embed="rId35"/>
+                    <a:stretch>
+                      <a:fillRect/>
+                    </a:stretch>
+                  </pic:blipFill>
+                  <pic:spPr>
+                    <a:xfrm>
+                      <a:off x="0" y="0"/>
+                      <a:ext cx="5212080" cy="2501798"/>
+                    </a:xfrm>
+                    <a:prstGeom prst="rect"/>
+                  </pic:spPr>
+                </pic:pic>
+              </a:graphicData>
+            </a:graphic>
+          </wp:inline>
+        </w:drawing>
+      </w:r>
+    </w:p>
+    <w:p>
+      <w:pPr>
+        <w:pStyle w:val="Beschriftung"/>
+      </w:pPr>
+      <w:r>
+        <w:t>Ereignis-Wallet-Anomalien je Ereignis und Anomalie-Familie</w:t>
+        <w:br/>
+        <w:t xml:space="preserve">(deskriptiv). Quelle: </w:t>
+      </w:r>
+      <w:r>
+        <w:rPr>
+          <w:b w:val="0"/>
+          <w:i/>
+        </w:rPr>
+        <w:t>data/results/thesis_h3_event_wallet_anomalies.png</w:t>
+      </w:r>
+      <w:r>
+        <w:t>.</w:t>
+      </w:r>
+    </w:p>
+    <w:p>
+      <w:pPr>
+        <w:pStyle w:val="berschrift3"/>
+      </w:pPr>
+      <w:r>
+        <w:rPr>
+          <w:b/>
+        </w:rPr>
+        <w:t>Was die Diagnostik nicht ist.</w:t>
+      </w:r>
+    </w:p>
+    <w:p>
+      <w:pPr/>
+      <w:r>
+        <w:t>Die Diagnostik arbeitet ausschliesslich mit aggregierten Tier-Zählungen und gibt keine Wallet-Adressen aus. Sie ist als historische, deskriptive Auffälligkeits-Diagnostik zu lesen und liefert Prüf-Hinweise, kein Beweis von privater Information, Insiderhandel, Fehlverhalten, Kausalität oder Profitabilität. Die spätere Review-Schicht, die solche Hinweise einordnet, wird in Kapitel 7 beschrieben.</w:t>
+      </w:r>
+    </w:p>
+    <w:p>
+      <w:pPr>
+        <w:pStyle w:val="berschrift3"/>
+      </w:pPr>
+      <w:r>
+        <w:rPr>
+          <w:b/>
+        </w:rPr>
+        <w:t>Limitation.</w:t>
+      </w:r>
+    </w:p>
+    <w:p>
+      <w:pPr/>
+      <w:r>
+        <w:t>Die Wallet-Daten enthalten nur Kauftransaktionen und sind quellseitig gefiltert, die Ausrichtung erfolgt auf Tagesebene, und über mehrere Tiers und Lags hinweg besteht ein Multiple-Testing-Problem. Die Granger- und Anomalie-Ausgaben sind deshalb als prädiktive Timing- und Auffälligkeits-Diagnostik zu lesen, nicht als Beweis von Kausalität, privater Information oder Profitabilität.</w:t>
+      </w:r>
+    </w:p>
+    <w:p>
+      <w:pPr>
+        <w:pStyle w:val="berschrift2"/>
+      </w:pPr>
+      <w:r>
+        <w:t>Signaturen informierten Handels und ein Verdachts-Profil</w:t>
+      </w:r>
+    </w:p>
+    <w:p>
+      <w:pPr/>
+      <w:r>
+        <w:t>Forschung und Praxis nennen wiederkehrende Signaturen informierten oder Insider-Handels: frische Wallets mit wenigen Lebenstransaktionen, die grosse Positionen eingehen, ungewöhnliche Positionsgrösse vor noch nicht angekündigten Ausgängen, abnormale Handelsgrösse und Volumen, hohe Konzentration und einseitiger Fluss sowie Aktivität, die sich gegen die Marktauflösung verdichtet. Akademisch zeigt Delvecchio (2026) für Kalshi-Märkte, dass informierter Handel real und über eine Abnormal-Trade-Size-Kennzahl detektierbar ist und sich gegen die Auflösung verstärkt, im Einklang mit dem Insider-Modell von Kyle (1985). Praktisch setzt Polymarket eine On-Chain-Überwachung ein, die unter anderem ungewöhnliche Positionsgrösse vor Ergebnissen und auffällige Wallets flaggt (Decrypt, 2026), gestützt auf forensische Heuristiken wie Funding-Quellen und Wallet-Clustering (Chainalysis, 2024). Konzeptionell rahmt Hanson (2007) Insiderhandel in Prognosemärkten.</w:t>
+      </w:r>
+    </w:p>
+    <w:p>
+      <w:pPr>
+        <w:pStyle w:val="berschrift3"/>
+      </w:pPr>
+      <w:r>
+        <w:rPr>
+          <w:b/>
+        </w:rPr>
+        <w:t>Profil aus dem getesteten Signatur-Modul.</w:t>
+      </w:r>
+    </w:p>
+    <w:p>
+      <w:pPr/>
+      <w:r>
+        <w:t>Dieselben Signaturen werden in einem deterministischen, getesteten Modul (</w:t>
+      </w:r>
+      <w:r>
+        <w:rPr>
+          <w:b w:val="0"/>
+          <w:i/>
+        </w:rPr>
+        <w:t>informed_trading_signature</w:t>
+      </w:r>
+      <w:r>
+        <w:t xml:space="preserve">) auf den BUY-seitigen Whale-Datensatz (ab 10 000 USD) anwenden. In den sieben Ereignisfenstern dominieren neu erscheinende Wallets. Im Median traten 54% der aktiven Wallets erst um das Ereignis herum erstmals auf (Spanne 48–69%), bei einer Top-1-Konzentration von im Median 64% (54–81%) und gegenüber der Vorperiode erhöhter Aktivität und erhöhtem Volumen (Abbildung). Das Modul fasst die Einzel-Signaturen perzentil-normalisiert zu einem </w:t>
+      </w:r>
+      <w:r>
+        <w:rPr>
+          <w:b w:val="0"/>
+          <w:i/>
+        </w:rPr>
+        <w:t>suspicion_score</w:t>
+      </w:r>
+      <w:r>
+        <w:t xml:space="preserve"> zusammen (Spanne 0.10–0.81, Median 0.55). Dieses Muster deckt sich mit der Literatur-Signatur aus frischen Wallets, grosser Positionsgrösse und Konzentration.</w:t>
+      </w:r>
+    </w:p>
+    <w:p>
+      <w:pPr>
+        <w:jc w:val="center"/>
+      </w:pPr>
+      <w:r>
+        <w:drawing>
+          <wp:inline xmlns:a="http://schemas.openxmlformats.org/drawingml/2006/main" xmlns:pic="http://schemas.openxmlformats.org/drawingml/2006/picture">
+            <wp:extent cx="5212080" cy="2663952"/>
+            <wp:docPr id="9" name="Picture 9"/>
+            <wp:cNvGraphicFramePr>
+              <a:graphicFrameLocks noChangeAspect="1"/>
+            </wp:cNvGraphicFramePr>
+            <a:graphic>
+              <a:graphicData uri="http://schemas.openxmlformats.org/drawingml/2006/picture">
+                <pic:pic>
+                  <pic:nvPicPr>
+                    <pic:cNvPr id="0" name="h3_informed_trading_profile.png"/>
+                    <pic:cNvPicPr/>
+                  </pic:nvPicPr>
+                  <pic:blipFill>
+                    <a:blip r:embed="rId36"/>
+                    <a:stretch>
+                      <a:fillRect/>
+                    </a:stretch>
+                  </pic:blipFill>
+                  <pic:spPr>
+                    <a:xfrm>
+                      <a:off x="0" y="0"/>
+                      <a:ext cx="5212080" cy="2663952"/>
+                    </a:xfrm>
+                    <a:prstGeom prst="rect"/>
+                  </pic:spPr>
+                </pic:pic>
+              </a:graphicData>
+            </a:graphic>
+          </wp:inline>
+        </w:drawing>
+      </w:r>
+    </w:p>
+    <w:p>
+      <w:pPr>
+        <w:pStyle w:val="Beschriftung"/>
+      </w:pPr>
+      <w:r>
+        <w:t>Ereignisfenster-Profil aus dem getesteten Signatur-Modul: Anteil neuer Wallets,</w:t>
+        <w:br/>
+        <w:t>Top-1-Konzentration und Fenster-Volumen je Ereignis (BUY-only, ab 10 000 USD).</w:t>
+        <w:br/>
+        <w:t xml:space="preserve">Quelle: </w:t>
+      </w:r>
+      <w:r>
+        <w:rPr>
+          <w:b w:val="0"/>
+          <w:i/>
+        </w:rPr>
+        <w:t>data/results/h3_informed_trading_signature.csv</w:t>
+      </w:r>
+      <w:r>
+        <w:t>.</w:t>
+      </w:r>
+    </w:p>
+    <w:p>
+      <w:pPr>
+        <w:pStyle w:val="berschrift3"/>
+      </w:pPr>
+      <w:r>
+        <w:rPr>
+          <w:b/>
+        </w:rPr>
+        <w:t>Verdachts-Profil als Hypothese.</w:t>
+      </w:r>
+    </w:p>
+    <w:p>
+      <w:pPr/>
+      <w:r>
+        <w:t>Daraus folgt ein Verdachts-Profil, das als Hypothese und Prüf-Filter dient. Ein Ereignisfenster ist prüfwürdig, wenn mehrere Signaturen gemeinsam auftreten – ein hoher Anteil neuer Wallets, hohe Konzentration, abnormale Aktiv-Wallet- und Volumen-Werte aus Abschnitt sowie ein Vorlauf der Tier-Aktivität vor der Preisbewegung aus der Lead-Lag- und Granger-Diagnostik. Genau diese Kombination speist die Review-Queue in Kapitel 7.</w:t>
+      </w:r>
+    </w:p>
+    <w:p>
+      <w:pPr>
+        <w:pStyle w:val="berschrift3"/>
+      </w:pPr>
+      <w:r>
+        <w:rPr>
+          <w:b/>
+        </w:rPr>
+        <w:t>Was das Profil nicht beweist.</w:t>
+      </w:r>
+    </w:p>
+    <w:p>
+      <w:pPr/>
+      <w:r>
+        <w:t>Ein hoher Anteil neuer Wallets ist kein Insider-Nachweis. Aufmerksamkeitsstarke Ereignisse ziehen allgemein neue Teilnehmer an, frische Adressen entstehen auch aus Datenschutz- oder Komfortgründen, und der Datensatz ist BUY-only und ab 10 000 USD gefiltert, was den Anteil neuer Wallets mechanisch erhöht. Zudem zeigen Tsang und Yang (2026) für die Oktober-Episode 2024, dass Kapital auf beide Marktseiten floss, vereinbar mit heterogenen Erwartungen statt Manipulation. Das Profil bleibt damit eine Verdachts-Hypothese und ein Prüf-Filter, kein Nachweis privater Information.</w:t>
+      </w:r>
+    </w:p>
+    <w:p>
+      <w:pPr>
+        <w:pStyle w:val="berschrift3"/>
+      </w:pPr>
+      <w:r>
+        <w:rPr>
+          <w:b/>
+        </w:rPr>
+        <w:t>Was die Diagnostik härten würde.</w:t>
+      </w:r>
+    </w:p>
+    <w:p>
+      <w:pPr/>
+      <w:r>
+        <w:t>Zur Härtung fehlen deterministische, getestete Merkmale: die Funding-Quelle der Wallets (zentrale Börse oder Mixer), Wallet-Lebensdauer und Transaktionszahl, einseitiger Fluss je Markt, der Vorlauf gegenüber verifizierten Nachrichten-Zeitstempeln und ein Out-of-Sample-Test gegen die wenigen dokumentierten Insider-Fälle. Diese Erweiterungen sind als Spezifikation vermerkt und bleiben an die Audit- und Wallet-Adress-Grenzen gebunden.</w:t>
       </w:r>
     </w:p>
     <w:p>
@@ -3741,13 +5740,150 @@
         <w:pStyle w:val="berschrift1"/>
       </w:pPr>
       <w:r>
-        <w:t>H3: Wallet-Timing</w:t>
+        <w:t>Erweiterungen: Monitor, Schweizer Abstimmung und praktischer Beitrag</w:t>
       </w:r>
     </w:p>
     <w:p>
       <w:pPr/>
       <w:r>
-        <w:t>[Inhalt folgt – wird im selben Stil ausgeschrieben wie Kapitel 1 und 2.]</w:t>
+        <w:t>Dieses Kapitel ordnet vier Erweiterungen ausserhalb des empirischen Kerns ein. Sie stützen die Forschungsfrage, ersetzen aber nicht den H1–H3-Beleg.</w:t>
+      </w:r>
+    </w:p>
+    <w:p>
+      <w:pPr>
+        <w:pStyle w:val="berschrift2"/>
+      </w:pPr>
+      <w:r>
+        <w:t>Schweizer Referendum als begrenzte Fallstudie</w:t>
+      </w:r>
+    </w:p>
+    <w:p>
+      <w:pPr/>
+      <w:r>
+        <w:t>Als aktueller, eigenständiger Vergleich dient die eidgenössische Abstimmung vom 14. Juni 2026. Beim offiziellen Ja-Anteil von 45.21% lag die finale Umfrage als Stimmenanteil näher am Resultat, während Polymarket im lokalen Live-Fenster (Ja zuletzt 21.5%) als binäre Ablehnungswahrscheinlichkeit klarer auf der richtigen Seite lag (Cutting et al., 2025). Wichtig: Polymarket-Preise sind Annahmewahrscheinlichkeiten, Umfragen sind Stimmenanteile. Der Binärvergleich ist nur ein transparenter Proxy und kein Mispricing-, Effizienz- oder Tradeability-Beweis (Abbildung).</w:t>
+      </w:r>
+    </w:p>
+    <w:p>
+      <w:pPr>
+        <w:jc w:val="center"/>
+      </w:pPr>
+      <w:r>
+        <w:drawing>
+          <wp:inline xmlns:a="http://schemas.openxmlformats.org/drawingml/2006/main" xmlns:pic="http://schemas.openxmlformats.org/drawingml/2006/picture">
+            <wp:extent cx="5212080" cy="2748188"/>
+            <wp:docPr id="10" name="Picture 10"/>
+            <wp:cNvGraphicFramePr>
+              <a:graphicFrameLocks noChangeAspect="1"/>
+            </wp:cNvGraphicFramePr>
+            <a:graphic>
+              <a:graphicData uri="http://schemas.openxmlformats.org/drawingml/2006/picture">
+                <pic:pic>
+                  <pic:nvPicPr>
+                    <pic:cNvPr id="0" name="swiss_referendum_10mio_final_case_study.png"/>
+                    <pic:cNvPicPr/>
+                  </pic:nvPicPr>
+                  <pic:blipFill>
+                    <a:blip r:embed="rId37"/>
+                    <a:stretch>
+                      <a:fillRect/>
+                    </a:stretch>
+                  </pic:blipFill>
+                  <pic:spPr>
+                    <a:xfrm>
+                      <a:off x="0" y="0"/>
+                      <a:ext cx="5212080" cy="2748188"/>
+                    </a:xfrm>
+                    <a:prstGeom prst="rect"/>
+                  </pic:spPr>
+                </pic:pic>
+              </a:graphicData>
+            </a:graphic>
+          </wp:inline>
+        </w:drawing>
+      </w:r>
+    </w:p>
+    <w:p>
+      <w:pPr>
+        <w:pStyle w:val="Beschriftung"/>
+      </w:pPr>
+      <w:r>
+        <w:t>Schweizer Referendum 14. Juni 2026: offizielles Resultat gegen</w:t>
+        <w:br/>
+        <w:t>Polymarket-Preise und Umfrage-Proxy (begrenzte Post-Resultat-Fallstudie).</w:t>
+        <w:br/>
+        <w:t xml:space="preserve">Quelle: </w:t>
+      </w:r>
+      <w:r>
+        <w:rPr>
+          <w:b w:val="0"/>
+          <w:i/>
+        </w:rPr>
+        <w:t>data/results/swiss_referendum_10mio_final_case_study.png</w:t>
+      </w:r>
+      <w:r>
+        <w:t>.</w:t>
+      </w:r>
+    </w:p>
+    <w:p>
+      <w:pPr>
+        <w:pStyle w:val="berschrift2"/>
+      </w:pPr>
+      <w:r>
+        <w:t>Anomalie-Review-Queue als Prüf-Workflow</w:t>
+      </w:r>
+    </w:p>
+    <w:p>
+      <w:pPr/>
+      <w:r>
+        <w:t>Die deterministische Anomalie-Diagnostik aus Abschnitt liefert Hinweise, die eine nachgelagerte Review-Schicht einordnet. Die aktuelle Review-Queue enthält drei Fälle: einen mit hoher Priorität, der als Prüf-Kandidat markiert ist, und zwei mit mittlerer Priorität als Beobachtungs-Hinweis. Alle drei stehen auf Quellenprüfung ausstehend. Bei der Überlappung mit den kuratierten Referenzfällen ergeben sich ein Treffer, eine teilweise und eine fehlende Überlappung.</w:t>
+      </w:r>
+    </w:p>
+    <w:p>
+      <w:pPr/>
+      <w:r>
+        <w:t>Diese Queue ist ausdrücklich ein menschlicher Prüf-Workflow über begrenzte, bereits berechnete Monitor-Artefakte. Die Risiko-Etiketten sind Beobachtungs-Marker, keine Befunde. Die Queue beweist weder private Information noch Fehlverhalten, Kausalität, Handelbarkeit, Profitabilität oder künftige Performance.</w:t>
+      </w:r>
+    </w:p>
+    <w:p>
+      <w:pPr>
+        <w:pStyle w:val="berschrift2"/>
+      </w:pPr>
+      <w:r>
+        <w:t>Politik-/Geo-Monitor als Read-only-Prototyp</w:t>
+      </w:r>
+    </w:p>
+    <w:p>
+      <w:pPr/>
+      <w:r>
+        <w:t>Der Monitor kombiniert Marktbewegung, aggregierte Wallet-Tier-Aktivität, Konzentration und Ereigniskontext zu deterministischen Prüf-Hinweisen (Bürgi et al., 2025; Wu, 2024). Er bleibt read-only, erzeugt keine Order- oder Trading-Pfade und liefert Prüf-Hinweise, keine kausale oder Effizienz-Evidenz. Im Haupttext erscheint er nur als Workflow, Fälle bleiben bis zur manuellen Prüfung im Anhang.</w:t>
+      </w:r>
+    </w:p>
+    <w:p>
+      <w:pPr>
+        <w:pStyle w:val="berschrift2"/>
+      </w:pPr>
+      <w:r>
+        <w:t>Agenten-gestützte Pipeline als dokumentierter Vertrag</w:t>
+      </w:r>
+    </w:p>
+    <w:p>
+      <w:pPr/>
+      <w:r>
+        <w:t>Die ursprünglich angestrebte Multiagenten-Pipeline ist hier als bewusst begrenzter, dokumentierter Vertrag verankert. Künftige Agenten dürfen Hinweise sichten und einordnen, aber keine Kennzahlen berechnen. Der Vertrag definiert vier Rollen: einen EventScout, der Ereigniskandidaten sammelt, einen CaseNarrative, der Fälle aus begrenzten Zusammenfassungen beschreibt, einen SkepticReviewer, der gegenprüft, und einen Orchestrator, der entscheidet. Eine spätere, ebenfalls vertraglich begrenzte MCP-Schicht stellt nur lesende Werkzeuge bereit (Anomalie-Review-Summary, Einzelfall, Artefaktliste, Methodengrenzen), mit maximal 50 Zeilen je Abfrage, ohne rohes SQL, ohne standardmässige Wallet-Adress-Ausgabe und mit Pflicht zur Protokollierung jeder LLM-Interaktion. Beide Verträge sind als nicht implementiert markiert und bleiben Future Work, bis der deterministische Kern und die Audit-Grenzen vollständig stehen.</w:t>
+      </w:r>
+    </w:p>
+    <w:p>
+      <w:pPr>
+        <w:pStyle w:val="berschrift2"/>
+      </w:pPr>
+      <w:r>
+        <w:t>Praktischer Beitrag: Monitoring-Werkzeug und Bau-Methodik</w:t>
+      </w:r>
+    </w:p>
+    <w:p>
+      <w:pPr/>
+      <w:r>
+        <w:t>Während der Untersuchung wurde Bedarf an einem praktischen Analyse-Werkzeug für Prognosemärkte erkennbar. Als Gestaltungsbeitrag wurde daraus ein laufendes, read-only Webprodukt entwickelt, das die Effizienz-Perspektive der Arbeit operationalisiert. Die Umsetzung selbst nutzte eine Multiagenten-Orchestrierung als Entwicklungsmethode, dokumentiert wird diese als Prozessbeitrag. Die Agenten erzeugten Software, berechneten aber keine thesis-relevanten Kennzahlen. Beide Punkte sind Sekundärbeiträge und dürfen die Forschungsfrage nicht überlagern. Umfang und Einordnung sind mit der Betreuung abzustimmen.</w:t>
       </w:r>
     </w:p>
     <w:p>
@@ -3755,13 +5891,87 @@
         <w:pStyle w:val="berschrift1"/>
       </w:pPr>
       <w:r>
-        <w:t>Erweiterungen: Monitor, Schweizer Abstimmung und praktischer Beitrag</w:t>
+        <w:t>Diskussion, Limitationen und Fazit</w:t>
+      </w:r>
+    </w:p>
+    <w:p>
+      <w:pPr>
+        <w:pStyle w:val="berschrift2"/>
+      </w:pPr>
+      <w:r>
+        <w:t>Synthese der Befunde</w:t>
       </w:r>
     </w:p>
     <w:p>
       <w:pPr/>
       <w:r>
-        <w:t>[Inhalt folgt – wird im selben Stil ausgeschrieben wie Kapitel 1 und 2.]</w:t>
+        <w:t xml:space="preserve">Die drei Hypothesen ergeben ein konsistentes, aber bewusst begrenztes Bild. H1 zeigt eine Polymarket-Stärke nur in einem definierten Vergleichsscope (262 von 285 State-Date-Zeilen, 9 von 9 States), während die breite Überlegenheit ungedeckt bleibt und das volle Panel ein Gegenbeispiel liefert. H2 zeigt plausible tägliche Reaktionen auf kuratierte Ereignisse, am deutlichsten beim Attentat auf Trump. H3 findet im obersten Wallet-Tier das klarste prädiktive Timing-Muster. Zusammen stützen die Befunde </w:t>
+      </w:r>
+      <w:r>
+        <w:rPr>
+          <w:b w:val="0"/>
+          <w:i/>
+        </w:rPr>
+        <w:t>begrenzte</w:t>
+      </w:r>
+      <w:r>
+        <w:t xml:space="preserve"> Diagnosen informationeller Effizienz, keine universelle Aussage.</w:t>
+      </w:r>
+    </w:p>
+    <w:p>
+      <w:pPr>
+        <w:pStyle w:val="berschrift2"/>
+      </w:pPr>
+      <w:r>
+        <w:t>Einordnung in die Literatur</w:t>
+      </w:r>
+    </w:p>
+    <w:p>
+      <w:pPr/>
+      <w:r>
+        <w:t>Der begrenzte H1-Vorteil ist mit Cutting et al. (2025) vereinbar, die einen Polymarket-Vorteil besonders in Swing States berichten, zugleich aber zur Vorsicht bei Verallgemeinerung mahnen. Die kritische Lesart von Wu (2024) – Märkte als reflexive Informationsplattform, nicht als «Truth Machine» – passt zum Gegenbeispiel im vollen Panel. Die H3-Vorsicht deckt sich mit Tsang und Yang (2026), deren Grosskonto-Befund heterogene Erwartungen statt Manipulation nahelegt, sowie mit der konzeptionellen Insider-Rahmung bei Hanson (2007).</w:t>
+      </w:r>
+    </w:p>
+    <w:p>
+      <w:pPr>
+        <w:pStyle w:val="berschrift2"/>
+      </w:pPr>
+      <w:r>
+        <w:t>Limitationen</w:t>
+      </w:r>
+    </w:p>
+    <w:p>
+      <w:pPr/>
+      <w:r>
+        <w:t>Die Evidenz stammt aus einem einzelnen Wahlkontext mit wiederholten Tageszeilen und erlaubt keine Mehr-Wahlen-Verallgemeinerung. H2 beruht auf Tagesdaten und identifiziert keine Intraday-Reaktionszeit (MacKinlay, 1997). Die H3-Wallet-Daten sind BUY-only und quellseitig gefiltert, die Ausrichtung erfolgt täglich, und über mehrere Tiers und Lags besteht ein Multiple-Testing-Problem (Granger, 1969). Verhaltensverzerrungen und erhöhte Volatilität (Rezabek, 2024) begrenzen die Tragweite zusätzlich.</w:t>
+      </w:r>
+    </w:p>
+    <w:p>
+      <w:pPr>
+        <w:pStyle w:val="berschrift2"/>
+      </w:pPr>
+      <w:r>
+        <w:t>Fazit</w:t>
+      </w:r>
+    </w:p>
+    <w:p>
+      <w:pPr/>
+      <w:r>
+        <w:t>Auf die Forschungsfrage antwortet die Arbeit differenziert: Polymarket verarbeitet Information im untersuchten Kontext nachweisbar gut, aber nur in klar abgegrenzten Fällen messbar besser als traditionelle Quellen. Die Stärke der Arbeit liegt weniger in einer einzelnen grossen Behauptung als in der reproduzierbaren, deterministisch geprüften Trennung von gestützter und nicht gestützter Evidenz (Fama, 1970).</w:t>
+      </w:r>
+    </w:p>
+    <w:p>
+      <w:pPr>
+        <w:pStyle w:val="berschrift2"/>
+      </w:pPr>
+      <w:r>
+        <w:t>Ausblick</w:t>
+      </w:r>
+    </w:p>
+    <w:p>
+      <w:pPr/>
+      <w:r>
+        <w:t>Über den empirischen Kern hinaus skizziert Kapitel 9 eine Agenten-gestützte Assistenzschicht, die künftig die Interpretation begrenzter, bereits berechneter Zusammenfassungen unterstützen kann, ohne selbst Kennzahlen zu berechnen.</w:t>
       </w:r>
     </w:p>
     <w:p>
@@ -3769,27 +5979,13 @@
         <w:pStyle w:val="berschrift1"/>
       </w:pPr>
       <w:r>
-        <w:t>Diskussion, Limitationen und Fazit</w:t>
+        <w:t>Ausblick: Agenten-gestützte Pipeline</w:t>
       </w:r>
     </w:p>
     <w:p>
       <w:pPr/>
       <w:r>
-        <w:t>[Inhalt folgt – wird im selben Stil ausgeschrieben wie Kapitel 1 und 2.]</w:t>
-      </w:r>
-    </w:p>
-    <w:p>
-      <w:pPr>
-        <w:pStyle w:val="berschrift1"/>
-      </w:pPr>
-      <w:r>
-        <w:t>Ausblick: Agenten-gestützte Pipeline</w:t>
-      </w:r>
-    </w:p>
-    <w:p>
-      <w:pPr/>
-      <w:r>
-        <w:t>[Inhalt folgt – wird im selben Stil ausgeschrieben wie Kapitel 1 und 2.]</w:t>
+        <w:t>Künftige Agenten dürfen Entwurfs-, Review- und Quellen-Prüf-Workflows nur aus begrenzten, bereits deterministisch berechneten Zusammenfassungen unterstützen. Sie berechnen keine Kennzahlen und greifen nicht ungefiltert auf Rohdaten zu, jede LLM-Interaktion wird protokolliert.</w:t>
       </w:r>
     </w:p>
     <w:p>
@@ -3836,6 +6032,22 @@
         <w:pStyle w:val="Literatureintrag"/>
       </w:pPr>
       <w:r>
+        <w:t>Arrow, K. J., Forsythe, R., Gorham, M. et al. (2008). The promise of prediction markets. Science, 320(5878), 877–878.</w:t>
+      </w:r>
+    </w:p>
+    <w:p>
+      <w:pPr>
+        <w:pStyle w:val="Literatureintrag"/>
+      </w:pPr>
+      <w:r>
+        <w:t>Berg, J. E., Nelson, F. D. &amp; Rietz, T. A. (2008). Prediction market accuracy in the long run. International Journal of Forecasting, 24(2), 285–300.</w:t>
+      </w:r>
+    </w:p>
+    <w:p>
+      <w:pPr>
+        <w:pStyle w:val="Literatureintrag"/>
+      </w:pPr>
+      <w:r>
         <w:t>Brier, G. W. (1950). Verification of forecasts expressed in terms of probability. Monthly Weather Review, 78(1), 1–3.</w:t>
       </w:r>
     </w:p>
@@ -3860,7 +6072,7 @@
         <w:pStyle w:val="Literatureintrag"/>
       </w:pPr>
       <w:r>
-        <w:t>Cutting, L. E., Hughes-Berheim, S. S., Johnson, P. M., Baroud, H. &amp; Goldstein, B. (2025). Are betting markets better than polling in predicting political elections? (arXiv:2507.08921). arXiv. https://arxiv.org/abs/2507.08921</w:t>
+        <w:t>Clinton, J. D. &amp; Huang, T. (2025). Prediction markets? The accuracy and efficiency of 2.4 billion in the 2024 presidential election [Preprint]. SocArXiv. https://osf.io/preprints/socarxiv/d5yx2</w:t>
       </w:r>
     </w:p>
     <w:p>
@@ -3868,6 +6080,14 @@
         <w:pStyle w:val="Literatureintrag"/>
       </w:pPr>
       <w:r>
+        <w:t>Cutting, L. E., Hughes-Berheim, S. S., Johnson, P. M., Baroud, H. &amp; Goldstein, B. (2025). Are betting markets better than polling in predicting political elections? (arXiv:2507.08921). arXiv.</w:t>
+      </w:r>
+    </w:p>
+    <w:p>
+      <w:pPr>
+        <w:pStyle w:val="Literatureintrag"/>
+      </w:pPr>
+      <w:r>
         <w:t>Decrypt. (2026). Polymarket launches market integrity tools following soldier's insider trading arrest. https://decrypt.co/366177/</w:t>
       </w:r>
     </w:p>
@@ -3876,7 +6096,7 @@
         <w:pStyle w:val="Literatureintrag"/>
       </w:pPr>
       <w:r>
-        <w:t>Delvecchio, E. (2026). Informed trading in prediction markets: Evidence from Kalshi mentions contracts [Senior Thesis, Claremont McKenna College]. https://scholarship.claremont.edu/cmc_theses/4166</w:t>
+        <w:t>Delvecchio, E. (2026). Informed trading in prediction markets: Evidence from Kalshi mentions contracts [Senior Thesis, Claremont McKenna College].</w:t>
       </w:r>
     </w:p>
     <w:p>
@@ -3900,6 +6120,14 @@
         <w:pStyle w:val="Literatureintrag"/>
       </w:pPr>
       <w:r>
+        <w:t>Gneiting, T. &amp; Raftery, A. E. (2007). Strictly proper scoring rules, prediction, and estimation. Journal of the American Statistical Association, 102(477), 359–378.</w:t>
+      </w:r>
+    </w:p>
+    <w:p>
+      <w:pPr>
+        <w:pStyle w:val="Literatureintrag"/>
+      </w:pPr>
+      <w:r>
         <w:t>Granger, C. W. J. (1969). Investigating causal relations by econometric models and cross-spectral methods. Econometrica, 37(3), 424–438.</w:t>
       </w:r>
     </w:p>
@@ -3908,7 +6136,7 @@
         <w:pStyle w:val="Literatureintrag"/>
       </w:pPr>
       <w:r>
-        <w:t>Hanson, R. (2007). Insider trading and prediction markets. George Mason University. https://mason.gmu.edu/~rhanson/insiderbet.pdf</w:t>
+        <w:t>Gruca, T. S. &amp; Rietz, T. A. (2025). Iowa Electronic Markets: Forecasting the 2024 U.S. presidential election. PS: Political Science &amp; Politics, 58(2).</w:t>
       </w:r>
     </w:p>
     <w:p>
@@ -3916,6 +6144,14 @@
         <w:pStyle w:val="Literatureintrag"/>
       </w:pPr>
       <w:r>
+        <w:t>Hanson, R. (2007). Insider trading and prediction markets. George Mason University. https://mason.gmu.edu/ rhanson/insiderbet.pdf</w:t>
+      </w:r>
+    </w:p>
+    <w:p>
+      <w:pPr>
+        <w:pStyle w:val="Literatureintrag"/>
+      </w:pPr>
+      <w:r>
         <w:t>Kyle, A. S. (1985). Continuous auctions and insider trading. Econometrica, 53(6), 1315–1335.</w:t>
       </w:r>
     </w:p>
@@ -3932,7 +6168,7 @@
         <w:pStyle w:val="Literatureintrag"/>
       </w:pPr>
       <w:r>
-        <w:t>Rezabek, P. (2024). Analysis of prediction markets in crypto: Investigating convergence in time, volatility and biases in Polymarket [Masterarbeit, Charles University]. http://hdl.handle.net/20.500.11956/194870</w:t>
+        <w:t>Manski, C. F. (2006). Interpreting the predictions of prediction markets. Economics Letters, 91(3), 425–429.</w:t>
       </w:r>
     </w:p>
     <w:p>
@@ -3940,7 +6176,7 @@
         <w:pStyle w:val="Literatureintrag"/>
       </w:pPr>
       <w:r>
-        <w:t>Tsang, K. P. &amp; Yang, Z. (2026). The anatomy of a blockchain prediction market: Polymarket in the 2024 U.S. presidential election (arXiv:2603.03136). arXiv. https://arxiv.org/abs/2603.03136</w:t>
+        <w:t>Rezabek, P. (2024). Analysis of prediction markets in crypto [Masterarbeit, Charles University].</w:t>
       </w:r>
     </w:p>
     <w:p>
@@ -3948,7 +6184,31 @@
         <w:pStyle w:val="Literatureintrag"/>
       </w:pPr>
       <w:r>
-        <w:t>Wu, L. (2024). Unveiling Polymarket: The positioning, expansion, and shadows of crypto prediction markets. Mint Ventures. https://research.mintventures.fund/2024/10/09/Unveiling-Polymarket</w:t>
+        <w:t>Tsang, K. P. &amp; Yang, Z. (2026). The anatomy of a blockchain prediction market: Polymarket in the 2024 U.S. presidential election (arXiv:2603.03136). arXiv.</w:t>
+      </w:r>
+    </w:p>
+    <w:p>
+      <w:pPr>
+        <w:pStyle w:val="Literatureintrag"/>
+      </w:pPr>
+      <w:r>
+        <w:t>Wolfers, J. &amp; Zitzewitz, E. (2004). Prediction markets. Journal of Economic Perspectives, 18(2), 107–126.</w:t>
+      </w:r>
+    </w:p>
+    <w:p>
+      <w:pPr>
+        <w:pStyle w:val="Literatureintrag"/>
+      </w:pPr>
+      <w:r>
+        <w:t>Wolfers, J. &amp; Zitzewitz, E. (2006). Interpreting prediction market prices as probabilities (NBER Working Paper Nr. 12200). NBER.</w:t>
+      </w:r>
+    </w:p>
+    <w:p>
+      <w:pPr>
+        <w:pStyle w:val="Literatureintrag"/>
+      </w:pPr>
+      <w:r>
+        <w:t>Wu, L. (2024). Unveiling Polymarket: The positioning, expansion, and shadows of crypto prediction markets. Mint Ventures.</w:t>
       </w:r>
     </w:p>
     <w:p>
@@ -4070,7 +6330,7 @@
           </w:tcPr>
           <w:p>
             <w:r>
-              <w:t>Recherche-Unterstützung, Strukturierung, Textentwürfe und Code-Unterstützung für die deterministische Analyse</w:t>
+              <w:t>Recherche, Strukturierung, Textentwürfe und Code-Unterstützung der deterministischen Analyse</w:t>
             </w:r>
           </w:p>
         </w:tc>
@@ -4080,7 +6340,7 @@
           </w:tcPr>
           <w:p>
             <w:r>
-              <w:t>Zu spezifizieren je Kapitel/Textstelle</w:t>
+              <w:t>je Kapitel zu spezifizieren</w:t>
             </w:r>
           </w:p>
         </w:tc>
@@ -4102,7 +6362,7 @@
           </w:tcPr>
           <w:p>
             <w:r>
-              <w:t>Code-Unterstützung für die deterministische Analyse-Pipeline (Python)</w:t>
+              <w:t>Code-Unterstützung der Analyse-Pipeline (Python)</w:t>
             </w:r>
           </w:p>
         </w:tc>
@@ -4134,7 +6394,7 @@
           </w:tcPr>
           <w:p>
             <w:r>
-              <w:t>Quellenverwaltung, Kurzbelege im Text und Literaturverzeichnis</w:t>
+              <w:t>Quellenverwaltung, Kurzbelege und Literaturverzeichnis</w:t>
             </w:r>
           </w:p>
         </w:tc>

</xml_diff>

<commit_message>
thesis: write out H2 chapter (event-study design, figure interpretation); regenerate Word
</commit_message>
<xml_diff>
--- a/thesis/Bachelorarbeit_FHNW.docx
+++ b/thesis/Bachelorarbeit_FHNW.docx
@@ -4706,7 +4706,7 @@
     <w:p>
       <w:pPr/>
       <w:r>
-        <w:t>H2 prüft, ob sich Polymarket-Wahrscheinlichkeiten um sieben vorab kuratierte öffentliche Ereignisse in plausibler Richtung und innerhalb fester Tagesfenster bewegen (MacKinlay, 1997; Fama, 1970). Die Ereignisse wurden vor der Analyse mit Zeitstempel und erwarteter Richtung fixiert.</w:t>
+        <w:t>H2 prüft, ob sich Polymarket-Wahrscheinlichkeiten um sieben vorab kuratierte öffentliche Ereignisse in plausibler Richtung und innerhalb fester Tagesfenster bewegen (MacKinlay, 1997; Fama, 1970). Methodisch folgt die Analyse dem Ereignisstudien-Design: Ein Schätzfenster vor dem Ereignis beschreibt das normale Bewegungsverhalten der Wahrscheinlichkeit, im Ereignisfenster wird die abnormale, also über dieses Normalverhalten hinausgehende Veränderung gemessen (MacKinlay, 1997). Alle sieben Ereignisse wurden vor der Analyse mit Zeitstempel und a-priori erwarteter Richtung fixiert, sodass die Auswahl nicht nachträglich an sichtbaren Preisbewegungen ausgerichtet ist. Drei Ereignisse tragen eine gerichtete Erwartung, die übrigen vier wurden neutral kuratiert.</w:t>
       </w:r>
     </w:p>
     <w:p>
@@ -4723,7 +4723,7 @@
     <w:p>
       <w:pPr/>
       <w:r>
-        <w:t>Die stärkste Primärfenster-Bewegung (0–1 Tag) zeigt das Attentat auf Trump am 13. Juli 2024 mit einer abnormalen Veränderung von +7.2 Prozentpunkten zugunsten von Trump. Die gerichtet erwarteten Ereignisse bewegen sich konsistent: die Verurteilung im Schweigegeld-Prozess (-4.1 pp) und Bidens Rückzug zugunsten von Harris (-1.7 pp für Trump) gehen in die erwartete Richtung. Die übrigen, als neutral kuratierten Ereignisse zeigen kleinere Bewegungen. Insgesamt reagieren die Polymarket-Wahrscheinlichkeiten auf Tagesebene plausibel auf die kuratierten Ereignisse.</w:t>
+        <w:t>Die stärkste Primärfenster-Bewegung (0–1 Tag) zeigt das Attentat auf Trump am 13. Juli 2024 mit einer abnormalen Veränderung von +7.2 Prozentpunkten zugunsten von Trump. Die gerichtet erwarteten Ereignisse bewegen sich konsistent: die Verurteilung im Schweigegeld-Prozess (-4.1 pp) und Bidens Rückzug zugunsten von Harris (-1.7 pp für Trump) gehen in die erwartete Richtung. Die vier neutral kuratierten Ereignisse, also die beiden Debatten und die VP-Nominierungen, zeigen kleinere und in der Richtung gemischte Bewegungen zwischen -2.9 und +3.5 Prozentpunkten, was zu ihrer offenen a-priori-Erwartung passt. Insgesamt reagieren die Polymarket-Wahrscheinlichkeiten auf Tagesebene plausibel auf die kuratierten Ereignisse.</w:t>
       </w:r>
     </w:p>
     <w:tbl>
@@ -5073,7 +5073,7 @@
         <w:pStyle w:val="Beschriftung"/>
       </w:pPr>
       <w:r>
-        <w:t>Tägliche Ereignisfenster-Bewegungen (F2). Quelle:</w:t>
+        <w:t>Tägliche Ereignisfenster-Bewegungen je Ereignis (F2). Quelle:</w:t>
         <w:br/>
       </w:r>
       <w:r>
@@ -5095,13 +5095,47 @@
         <w:rPr>
           <w:b/>
         </w:rPr>
+        <w:t>Lesart der Abbildung.</w:t>
+      </w:r>
+    </w:p>
+    <w:p>
+      <w:pPr/>
+      <w:r>
+        <w:t>Abbildung stellt je Ereignis die abnormale Veränderung im Primärfenster dar und ordnet sie nach Stärke und Richtung. Sichtbar wird ein abgestuftes Muster: das Attentat als deutlichster Ausschlag, die beiden anderen gerichteten Ereignisse als klar erwartungskonforme, aber kleinere Bewegungen, und die neutralen Ereignisse als gestreutes Band um null. Die Abbildung macht damit zweierlei sichtbar – dass der Markt auf gerichtete Ereignisse erwartungsgemäss reagiert, und dass auch ohne vorgezeichnete Richtung Bewegung entsteht, wie sie neue öffentliche Information erwarten lässt.</w:t>
+      </w:r>
+    </w:p>
+    <w:p>
+      <w:pPr>
+        <w:pStyle w:val="berschrift3"/>
+      </w:pPr>
+      <w:r>
+        <w:rPr>
+          <w:b/>
+        </w:rPr>
+        <w:t>Einordnung.</w:t>
+      </w:r>
+    </w:p>
+    <w:p>
+      <w:pPr/>
+      <w:r>
+        <w:t>Das Muster ist mit einer halbstrengen Markteffizienz vereinbar, bei der öffentliche Information zügig in den Preis einfliesst (Fama, 1970). Es handelt sich jedoch um eine deskriptive, gerichtete Reaktionsdiagnostik und nicht um einen Kausalnachweis: Die abnormale Veränderung zeigt, dass sich die Wahrscheinlichkeit um das Ereignis herum in plausibler Richtung bewegt, nicht, dass allein das Ereignis sie verursacht hat.</w:t>
+      </w:r>
+    </w:p>
+    <w:p>
+      <w:pPr>
+        <w:pStyle w:val="berschrift3"/>
+      </w:pPr>
+      <w:r>
+        <w:rPr>
+          <w:b/>
+        </w:rPr>
         <w:t>Limitation.</w:t>
       </w:r>
     </w:p>
     <w:p>
       <w:pPr/>
       <w:r>
-        <w:t>Die Analyse beruht auf Tagespreisen und kann keine Intraday-Reaktionszeit identifizieren, H2 stützt damit eine Aussage über tägliche Reaktionsmuster, nicht über sofortige Marktreaktion. Da die Ereignisse vorab fixiert wurden, besteht keine nachträgliche Auswahl nach sichtbaren Preisbewegungen.</w:t>
+        <w:t>Die Analyse beruht auf Tagespreisen und kann keine Intraday-Reaktionszeit identifizieren, H2 stützt damit eine Aussage über tägliche Reaktionsmuster, nicht über sofortige Marktreaktion. Die sieben Ereignisse sind eine kleine, kuratierte Stichprobe ohne formalen Signifikanztest je Ereignis, und mehrere fielen in eine Phase dichter Nachrichtenlage, sodass sich Einflüsse überlagern können. Da die Ereignisse vorab fixiert wurden, besteht aber keine nachträgliche Auswahl nach sichtbaren Preisbewegungen.</w:t>
       </w:r>
     </w:p>
     <w:p>

</xml_diff>

<commit_message>
thesis: fix table column-spec leak in Word export; regenerate
</commit_message>
<xml_diff>
--- a/thesis/Bachelorarbeit_FHNW.docx
+++ b/thesis/Bachelorarbeit_FHNW.docx
@@ -3761,9 +3761,6 @@
           <w:p>
             <w:r/>
             <w:r>
-              <w:t>llll@{}}</w:t>
-              <w:br/>
-              <w:br/>
               <w:t>Quelle</w:t>
             </w:r>
           </w:p>
@@ -4364,9 +4361,6 @@
           <w:p>
             <w:r/>
             <w:r>
-              <w:t>lll@{}}</w:t>
-              <w:br/>
-              <w:br/>
               <w:t>Vergleichsscope</w:t>
             </w:r>
           </w:p>
@@ -4745,9 +4739,6 @@
           <w:p>
             <w:r/>
             <w:r>
-              <w:t>llr@{}}</w:t>
-              <w:br/>
-              <w:br/>
               <w:t>Ereignis (2024)</w:t>
             </w:r>
           </w:p>
@@ -5397,9 +5388,6 @@
           <w:p>
             <w:r/>
             <w:r>
-              <w:t>lrrr@{}}</w:t>
-              <w:br/>
-              <w:br/>
               <w:t>Tier</w:t>
             </w:r>
           </w:p>

</xml_diff>

<commit_message>
thesis: restructure to FHNW Projekt-/Bachelorarbeit form (4b: Analyse/Schlussfolgerung/Loesung/...)
</commit_message>
<xml_diff>
--- a/thesis/Bachelorarbeit_FHNW.docx
+++ b/thesis/Bachelorarbeit_FHNW.docx
@@ -3493,7 +3493,7 @@
     <w:p>
       <w:pPr/>
       <w:r>
-        <w:t>Der empirische Kern ist ein vollständig deterministischer, getesteter Python-Analysepfad, der alle Kennzahlen berechnet, bevor sie interpretiert werden. Als Sekundärbeiträge dokumentiert die Arbeit ein aus der Untersuchung hervorgegangenes read-only Monitoring-Werkzeug sowie die Multiagenten-Methodik seiner Entwicklung (Kapitel 7). Diese Sekundärbeiträge stützen die Forschungsfrage, ersetzen aber den empirischen Beleg nicht und überlagern ihn nicht.</w:t>
+        <w:t>Der empirische Kern ist ein vollständig deterministischer, getesteter Python-Analysepfad, der alle Kennzahlen berechnet, bevor sie interpretiert werden. Als Sekundärbeiträge dokumentiert die Arbeit ein aus der Untersuchung hervorgegangenes read-only Monitoring-Werkzeug sowie die Multiagenten-Methodik seiner Entwicklung (Kapitel 4). Diese Sekundärbeiträge stützen die Forschungsfrage, ersetzen aber den empirischen Beleg nicht und überlagern ihn nicht.</w:t>
       </w:r>
     </w:p>
     <w:p>
@@ -3507,7 +3507,7 @@
     <w:p>
       <w:pPr/>
       <w:r>
-        <w:t>Die Arbeit ist in der Struktur einer empirischen Forschungsarbeit aufgebaut. Kapitel 2 ordnet Theorie und Literatur ein und entwickelt die Forschungslücke. Kapitel 3 beschreibt Daten, Aufbereitung und die deterministischen Verfahren für H1 bis H3. Die Kapitel 4 bis 6 berichten die Ergebnisse der drei Hypothesen. Kapitel 7 stellt die Erweiterungen vor, darunter den Monitor, die Schweizer Fallstudie und den praktischen Beitrag. Kapitel 8 führt die Befunde zusammen, diskutiert die Limitationen und zieht das Fazit, und Kapitel 9 skizziert den agentengestützten Ausblick.</w:t>
+        <w:t>Die Arbeit folgt der Struktur einer Projekt- und Bachelorarbeit. Kapitel 2 analysiert die Situation: Es ordnet die bisherige Forschung ein (Abschnitt 2.1), beschreibt Daten und Methodik (Abschnitt 2.2) und berichtet die empirische Analyse zu H1, H2 und H3. Kapitel 3 zieht die Schlussfolgerung aus dieser Analyse. Kapitel 4 stellt als Lösung das daraus entwickelte read-only Monitoring-Werkzeug samt Agenten-Orchestrierung vor und validiert es an einer Schweizer Fallstudie. Kapitel 5 zieht die allgemeine Schlussfolgerung und benennt die Einschränkungen, Kapitel 6 skizziert die nächsten Schritte.</w:t>
       </w:r>
     </w:p>
     <w:p>
@@ -3515,7 +3515,15 @@
         <w:pStyle w:val="berschrift1"/>
       </w:pPr>
       <w:r>
-        <w:t>Theoretischer Rahmen und Forschungsstand</w:t>
+        <w:t>Analyse der Situation</w:t>
+      </w:r>
+    </w:p>
+    <w:p>
+      <w:pPr>
+        <w:pStyle w:val="berschrift2"/>
+      </w:pPr>
+      <w:r>
+        <w:t>Bisherige Forschung</w:t>
       </w:r>
     </w:p>
     <w:p>
@@ -3526,9 +3534,12 @@
     </w:p>
     <w:p>
       <w:pPr>
-        <w:pStyle w:val="berschrift2"/>
-      </w:pPr>
-      <w:r>
+        <w:pStyle w:val="berschrift3"/>
+      </w:pPr>
+      <w:r>
+        <w:rPr>
+          <w:b/>
+        </w:rPr>
         <w:t>Begriffsklärung</w:t>
       </w:r>
     </w:p>
@@ -3603,125 +3614,146 @@
     </w:p>
     <w:p>
       <w:pPr>
+        <w:pStyle w:val="berschrift3"/>
+      </w:pPr>
+      <w:r>
+        <w:rPr>
+          <w:b/>
+        </w:rPr>
+        <w:t>Markteffizienz und Informationsaggregation</w:t>
+      </w:r>
+    </w:p>
+    <w:p>
+      <w:pPr/>
+      <w:r>
+        <w:t>Der theoretische Ausgangspunkt ist die Markteffizienzhypothese (Fama, 1970), nach der Preise verfügbare Information widerspiegeln. Üblich ist die Unterscheidung in eine schwache, eine halbstrenge und eine strenge Form, je nachdem, ob historische Preise, alle öffentlichen Informationen oder auch private Informationen bereits eingepreist sind. Auf Prognosemärkte übertragen heisst das: Wenn genügend Teilnehmende ihre Erwartungen laufend an neue Evidenz anpassen, sollte der Marktpreis als Wahrscheinlichkeit die verfügbare Information bündeln.</w:t>
+      </w:r>
+    </w:p>
+    <w:p>
+      <w:pPr/>
+      <w:r>
+        <w:t>Diesen Aggregationsmechanismus beschreibt Hanson (2007) konzeptionell und verweist auf Vergleiche, in denen spekulative Märkte Experteneinschätzungen und Umfragen erreichen oder schlagen. Breiter zeigen Wolfers und Zitzewitz (2004), dass marktbasierte Forecasts meist treffsicher sind und einfache Benchmarks übertreffen, und ein interdisziplinäres Autorenkollektiv ordnet Prognosemärkte als legitimes, informationsaggregierendes Instrument ein (Arrow, 2008). Unter welchen Bedingungen der Marktpreis tatsächlich der mittleren Erwartung der Teilnehmenden entspricht, präzisieren Wolfers und Zitzewitz (2006). Zugleich mahnt Manski (2006) zur Vorsicht, weil Preise Erwartungen mit Risikopräferenzen vermengen, sodass die Gleichsetzung von Preis und Wahrscheinlichkeit nicht unbesehen gilt. Die Idee der Informationsaggregation (häufig als Weisheit der Vielen bezeichnet) motiviert daher, einen Marktpreis als Forecast zu behandeln, bleibt aber eine empirisch zu prüfende Annahme.</w:t>
+      </w:r>
+    </w:p>
+    <w:p>
+      <w:pPr>
+        <w:pStyle w:val="berschrift3"/>
+      </w:pPr>
+      <w:r>
+        <w:rPr>
+          <w:b/>
+        </w:rPr>
+        <w:t>Prognosemärkte im Vergleich zu traditionellen Quellen</w:t>
+      </w:r>
+    </w:p>
+    <w:p>
+      <w:pPr/>
+      <w:r>
+        <w:t>Ob Märkte Umfragen tatsächlich überlegen sind, ist empirisch umstritten. Für die etablierten Iowa Electronic Markets zeigen Berg et al. (2008), dass Marktprognosen Umfragen über fünf Präsidentschaftswahlen hinweg in rund 74 Prozent der Vergleiche näher am Ergebnis lagen, mit eher wachsendem Vorsprung bei längerem Horizont, und Gruca und Rietz (2025) setzen diese Markt-Perspektive für die Wahl 2024 fort. Speziell für Polymarket finden Cutting et al. (2025) einen Vorteil gegenüber Umfragen, besonders in den umkämpften Swing States, und ordnen ihn der Wisdom-of-Crowds-Idee zu. Zugleich betonen sie ausdrücklich, dass die Ergebnisse weiterer Untersuchung und einer Prüfung auf Übertragbarkeit bedürfen. Dem steht eine kritische Sicht gegenüber: Wu (2024) argumentiert, dass Prognosemärkte keine «Truth Machine» sind, sondern reflexiv sein können – Vertrauen in den Marktpreis kann die laufende Informationsaktualisierung schwächen und so die Genauigkeit untergraben. Eine plattformübergreifende Auswertung relativiert das Bild zusätzlich: Clinton und Huang (2025) berichten für 2024 stark schwankende Trefferquoten zwischen den Börsen, wobei Polymarket nicht durchgehend führte.</w:t>
+      </w:r>
+    </w:p>
+    <w:p>
+      <w:pPr/>
+      <w:r>
+        <w:t>Auch die Mikrostruktur solcher Märkte ist relevant. Bürgi et al. (2025) analysieren am Beispiel von Kalshi das Zusammenspiel von liquiditätsgebenden und liquiditätsnehmenden Teilnehmenden und zeigen, dass die Preisqualität von der Marktstruktur und den Anreizen abhängt. Diese Spannung zwischen belegtem Vorteil und berechtigter Vorsicht begründet, warum die vorliegende Arbeit nur begrenzte, scope-spezifische Aussagen anstrebt.</w:t>
+      </w:r>
+    </w:p>
+    <w:p>
+      <w:pPr>
+        <w:pStyle w:val="berschrift3"/>
+      </w:pPr>
+      <w:r>
+        <w:rPr>
+          <w:b/>
+        </w:rPr>
+        <w:t>Messung von Prognosequalität</w:t>
+      </w:r>
+    </w:p>
+    <w:p>
+      <w:pPr/>
+      <w:r>
+        <w:t>Zur Messung der Forecast-Qualität dient der Brier-Score (Brier, 1950), definiert als mittlere quadratische Abweichung zwischen Wahrscheinlichkeitsprognose und tatsächlichem Ausgang. Ein niedrigerer Brier-Verlust bedeutet eine bessere Prognose, und der Score belohnt sowohl Treffsicherheit als auch gute Kalibrierung. Formal ist der Brier-Score eine strikt-proper Scoring Rule (Gneiting &amp; Raftery, 2007), das heisst, die erwartete Bewertung wird genau dann minimiert, wenn die wahren Wahrscheinlichkeiten berichtet werden – strategisches Verzerren lohnt sich nicht. Der Vergleich zweier Verlustreihen erfolgt mit dem Diebold-Mariano-Test (Diebold &amp; Mariano, 1995), der prüft, ob zwei Prognosen im Mittel gleich genau sind, ohne einen bestimmten Entstehungsmechanismus zu unterstellen. Beide Verfahren gelten als etablierte, deterministisch berechenbare Masse der Forecast-Bewertung und bilden die methodische Grundlage von H1.</w:t>
+      </w:r>
+    </w:p>
+    <w:p>
+      <w:pPr>
+        <w:pStyle w:val="berschrift3"/>
+      </w:pPr>
+      <w:r>
+        <w:rPr>
+          <w:b/>
+        </w:rPr>
+        <w:t>Ereignisstudien</w:t>
+      </w:r>
+    </w:p>
+    <w:p>
+      <w:pPr/>
+      <w:r>
+        <w:t>Die Reaktion eines Marktes auf neue Information lässt sich mit Ereignisstudien untersuchen (MacKinlay, 1997). Das Verfahren definiert ein Schätzfenster für das normale Verhalten und ein Ereignisfenster, in dem abnormale und kumulierte abnormale Bewegungen gemessen werden. Ursprünglich für Aktienrenditen entwickelt, lässt sich das Design auf Tagesebene und auf Wahrscheinlichkeits- zeitreihen übertragen. H2 nutzt dieses Design mit vorab fixierten, kuratierten öffentlichen Ereignissen, um die Reaktionsrichtung von Polymarket nachvollziehbar zu prüfen.</w:t>
+      </w:r>
+    </w:p>
+    <w:p>
+      <w:pPr>
+        <w:pStyle w:val="berschrift3"/>
+      </w:pPr>
+      <w:r>
+        <w:rPr>
+          <w:b/>
+        </w:rPr>
+        <w:t>On-Chain-Aktivität und informierter Handel</w:t>
+      </w:r>
+    </w:p>
+    <w:p>
+      <w:pPr/>
+      <w:r>
+        <w:t>Die Blockchain-Abwicklung macht Wallet-Aktivität sichtbar und eröffnet die Frage, ob bestimmte Adressen Preisbewegungen zeitlich vorauslaufen. Methodisch nutzt H3 Lead-Lag-Korrelationen und Granger-Tests (Granger, 1969), deren Ergebnisse ausdrücklich als prädiktive Timing-Diagnostik und nicht als strukturelle Kausalität zu lesen sind. Theoretisch rahmt das Modell von Kyle (1985) informierten Handel: Eine informierte Partei verbirgt ihre Order im normalen Handelsfluss, was sich in abnormaler Handelsgrösse niederschlagen kann. Empirisch zeigt Delvecchio (2026) für Kalshi-Märkte, dass informierter Handel real und über eine Abnormal-Trade-Size-Kennzahl detektierbar ist und sich gegen die Marktauflösung verstärkt.</w:t>
+      </w:r>
+    </w:p>
+    <w:p>
+      <w:pPr/>
+      <w:r>
+        <w:t>Für die gebotene Vorsicht sprechen mehrere Befunde. Tsang und Yang (2026) zeigen für die Oktober-Grosskonto-Episode 2024, dass Kapital gleichzeitig auf beide Marktseiten floss – ein Muster, das mit heterogenen Erwartungen und nicht mit einseitiger Ma</w:t>
+      </w:r>
+    </w:p>
+    <w:p>
+      <w:pPr>
         <w:pStyle w:val="berschrift2"/>
       </w:pPr>
       <w:r>
-        <w:t>Markteffizienz und Informationsaggregation</w:t>
+        <w:t>Daten und Methodik</w:t>
+      </w:r>
+    </w:p>
+    <w:p>
+      <w:pPr>
+        <w:pStyle w:val="berschrift3"/>
+      </w:pPr>
+      <w:r>
+        <w:rPr>
+          <w:b/>
+        </w:rPr>
+        <w:t>Forschungsdesign: deterministischer Kern vor Interpretation</w:t>
       </w:r>
     </w:p>
     <w:p>
       <w:pPr/>
       <w:r>
-        <w:t>Der theoretische Ausgangspunkt ist die Markteffizienzhypothese (Fama, 1970), nach der Preise verfügbare Information widerspiegeln. Üblich ist die Unterscheidung in eine schwache, eine halbstrenge und eine strenge Form, je nachdem, ob historische Preise, alle öffentlichen Informationen oder auch private Informationen bereits eingepreist sind. Auf Prognosemärkte übertragen heisst das: Wenn genügend Teilnehmende ihre Erwartungen laufend an neue Evidenz anpassen, sollte der Marktpreis als Wahrscheinlichkeit die verfügbare Information bündeln.</w:t>
+        <w:t>Die Arbeit prüft informationelle Effizienz nicht als direkt beobachtbare Eigenschaft, sondern über drei reproduzierbare Proxy-Tests: Prognosequalität (H1), Ereignisreaktion (H2) und Wallet-Timing (H3). Diese Operationalisierung folgt dem Effizienzbegriff der Markteffizienzhypothese (Fama, 1970) und überträgt ihn auf einen dezentralen Prognosemarkt, dessen Preispfad als primäre Zeitreihe behandelt wird.</w:t>
       </w:r>
     </w:p>
     <w:p>
       <w:pPr/>
       <w:r>
-        <w:t>Diesen Aggregationsmechanismus beschreibt Hanson (2007) konzeptionell und verweist auf Vergleiche, in denen spekulative Märkte Experteneinschätzungen und Umfragen erreichen oder schlagen. Breiter zeigen Wolfers und Zitzewitz (2004), dass marktbasierte Forecasts meist treffsicher sind und einfache Benchmarks übertreffen, und ein interdisziplinäres Autorenkollektiv ordnet Prognosemärkte als legitimes, informationsaggregierendes Instrument ein (Arrow, 2008). Unter welchen Bedingungen der Marktpreis tatsächlich der mittleren Erwartung der Teilnehmenden entspricht, präzisieren Wolfers und Zitzewitz (2006). Zugleich mahnt Manski (2006) zur Vorsicht, weil Preise Erwartungen mit Risikopräferenzen vermengen, sodass die Gleichsetzung von Preis und Wahrscheinlichkeit nicht unbesehen gilt. Die Idee der Informationsaggregation (häufig als Weisheit der Vielen bezeichnet) motiviert daher, einen Marktpreis als Forecast zu behandeln, bleibt aber eine empirisch zu prüfende Annahme.</w:t>
-      </w:r>
-    </w:p>
-    <w:p>
-      <w:pPr>
-        <w:pStyle w:val="berschrift2"/>
-      </w:pPr>
-      <w:r>
-        <w:t>Prognosemärkte im Vergleich zu traditionellen Quellen</w:t>
-      </w:r>
-    </w:p>
-    <w:p>
-      <w:pPr/>
-      <w:r>
-        <w:t>Ob Märkte Umfragen tatsächlich überlegen sind, ist empirisch umstritten. Für die etablierten Iowa Electronic Markets zeigen Berg et al. (2008), dass Marktprognosen Umfragen über fünf Präsidentschaftswahlen hinweg in rund 74 Prozent der Vergleiche näher am Ergebnis lagen, mit eher wachsendem Vorsprung bei längerem Horizont, und Gruca und Rietz (2025) setzen diese Markt-Perspektive für die Wahl 2024 fort. Speziell für Polymarket finden Cutting et al. (2025) einen Vorteil gegenüber Umfragen, besonders in den umkämpften Swing States, und ordnen ihn der Wisdom-of-Crowds-Idee zu. Zugleich betonen sie ausdrücklich, dass die Ergebnisse weiterer Untersuchung und einer Prüfung auf Übertragbarkeit bedürfen. Dem steht eine kritische Sicht gegenüber: Wu (2024) argumentiert, dass Prognosemärkte keine «Truth Machine» sind, sondern reflexiv sein können – Vertrauen in den Marktpreis kann die laufende Informationsaktualisierung schwächen und so die Genauigkeit untergraben. Eine plattformübergreifende Auswertung relativiert das Bild zusätzlich: Clinton und Huang (2025) berichten für 2024 stark schwankende Trefferquoten zwischen den Börsen, wobei Polymarket nicht durchgehend führte.</w:t>
-      </w:r>
-    </w:p>
-    <w:p>
-      <w:pPr/>
-      <w:r>
-        <w:t>Auch die Mikrostruktur solcher Märkte ist relevant. Bürgi et al. (2025) analysieren am Beispiel von Kalshi das Zusammenspiel von liquiditätsgebenden und liquiditätsnehmenden Teilnehmenden und zeigen, dass die Preisqualität von der Marktstruktur und den Anreizen abhängt. Diese Spannung zwischen belegtem Vorteil und berechtigter Vorsicht begründet, warum die vorliegende Arbeit nur begrenzte, scope-spezifische Aussagen anstrebt.</w:t>
-      </w:r>
-    </w:p>
-    <w:p>
-      <w:pPr>
-        <w:pStyle w:val="berschrift2"/>
-      </w:pPr>
-      <w:r>
-        <w:t>Messung von Prognosequalität</w:t>
-      </w:r>
-    </w:p>
-    <w:p>
-      <w:pPr/>
-      <w:r>
-        <w:t>Zur Messung der Forecast-Qualität dient der Brier-Score (Brier, 1950), definiert als mittlere quadratische Abweichung zwischen Wahrscheinlichkeitsprognose und tatsächlichem Ausgang. Ein niedrigerer Brier-Verlust bedeutet eine bessere Prognose, und der Score belohnt sowohl Treffsicherheit als auch gute Kalibrierung. Formal ist der Brier-Score eine strikt-proper Scoring Rule (Gneiting &amp; Raftery, 2007), das heisst, die erwartete Bewertung wird genau dann minimiert, wenn die wahren Wahrscheinlichkeiten berichtet werden – strategisches Verzerren lohnt sich nicht. Der Vergleich zweier Verlustreihen erfolgt mit dem Diebold-Mariano-Test (Diebold &amp; Mariano, 1995), der prüft, ob zwei Prognosen im Mittel gleich genau sind, ohne einen bestimmten Entstehungsmechanismus zu unterstellen. Beide Verfahren gelten als etablierte, deterministisch berechenbare Masse der Forecast-Bewertung und bilden die methodische Grundlage von H1.</w:t>
-      </w:r>
-    </w:p>
-    <w:p>
-      <w:pPr>
-        <w:pStyle w:val="berschrift2"/>
-      </w:pPr>
-      <w:r>
-        <w:t>Ereignisstudien</w:t>
-      </w:r>
-    </w:p>
-    <w:p>
-      <w:pPr/>
-      <w:r>
-        <w:t>Die Reaktion eines Marktes auf neue Information lässt sich mit Ereignisstudien untersuchen (MacKinlay, 1997). Das Verfahren definiert ein Schätzfenster für das normale Verhalten und ein Ereignisfenster, in dem abnormale und kumulierte abnormale Bewegungen gemessen werden. Ursprünglich für Aktienrenditen entwickelt, lässt sich das Design auf Tagesebene und auf Wahrscheinlichkeits- zeitreihen übertragen. H2 nutzt dieses Design mit vorab fixierten, kuratierten öffentlichen Ereignissen, um die Reaktionsrichtung von Polymarket nachvollziehbar zu prüfen.</w:t>
-      </w:r>
-    </w:p>
-    <w:p>
-      <w:pPr>
-        <w:pStyle w:val="berschrift2"/>
-      </w:pPr>
-      <w:r>
-        <w:t>On-Chain-Aktivität und informierter Handel</w:t>
-      </w:r>
-    </w:p>
-    <w:p>
-      <w:pPr/>
-      <w:r>
-        <w:t>Die Blockchain-Abwicklung macht Wallet-Aktivität sichtbar und eröffnet die Frage, ob bestimmte Adressen Preisbewegungen zeitlich vorauslaufen. Methodisch nutzt H3 Lead-Lag-Korrelationen und Granger-Tests (Granger, 1969), deren Ergebnisse ausdrücklich als prädiktive Timing-Diagnostik und nicht als strukturelle Kausalität zu lesen sind. Theoretisch rahmt das Modell von Kyle (1985) informierten Handel: Eine informierte Partei verbirgt ihre Order im normalen Handelsfluss, was sich in abnormaler Handelsgrösse niederschlagen kann. Empirisch zeigt Delvecchio (2026) für Kalshi-Märkte, dass informierter Handel real und über eine Abnormal-Trade-Size-Kennzahl detektierbar ist und sich gegen die Marktauflösung verstärkt.</w:t>
-      </w:r>
-    </w:p>
-    <w:p>
-      <w:pPr/>
-      <w:r>
-        <w:t>Für die gebotene Vorsicht sprechen mehrere Befunde. Tsang und Yang (2026) zeigen für die Oktober-Grosskonto-Episode 2024, dass Kapital gleichzeitig auf beide Marktseiten floss – ein Muster, das mit heterogenen Erwartungen und nicht mit einseitiger Ma</w:t>
-      </w:r>
-    </w:p>
-    <w:p>
-      <w:pPr>
-        <w:pStyle w:val="berschrift1"/>
-      </w:pPr>
-      <w:r>
-        <w:t>Daten und Methodik</w:t>
-      </w:r>
-    </w:p>
-    <w:p>
-      <w:pPr>
-        <w:pStyle w:val="berschrift2"/>
-      </w:pPr>
-      <w:r>
-        <w:t>Forschungsdesign: deterministischer Kern vor Interpretation</w:t>
-      </w:r>
-    </w:p>
-    <w:p>
-      <w:pPr/>
-      <w:r>
-        <w:t>Die Arbeit prüft informationelle Effizienz nicht als direkt beobachtbare Eigenschaft, sondern über drei reproduzierbare Proxy-Tests: Prognosequalität (H1), Ereignisreaktion (H2) und Wallet-Timing (H3). Diese Operationalisierung folgt dem Effizienzbegriff der Markteffizienzhypothese (Fama, 1970) und überträgt ihn auf einen dezentralen Prognosemarkt, dessen Preispfad als primäre Zeitreihe behandelt wird.</w:t>
-      </w:r>
-    </w:p>
-    <w:p>
-      <w:pPr/>
-      <w:r>
         <w:t>Methodisch gilt eine strikte Trennung: Alle statistischen Kennzahlen werden deterministisch in Python berechnet, versioniert und als Artefakt (CSV, JSON, PNG) abgelegt. Sprachmodelle oder Agenten berechnen keine Metriken, sie dürfen ausschliesslich bereits berechnete, begrenzte Ergebnisse interpretieren, und auch das erst nach dokumentierter Freigabe und Audit-Protokollierung. Diese Reihenfolge – Datenvalidierung, deterministische Analyse, danach Interpretation – sichert Nachvollziehbarkeit und schützt vor versteckten Berechnungen im Fliesstext.</w:t>
       </w:r>
     </w:p>
     <w:p>
       <w:pPr>
-        <w:pStyle w:val="berschrift2"/>
-      </w:pPr>
-      <w:r>
+        <w:pStyle w:val="berschrift3"/>
+      </w:pPr>
+      <w:r>
+        <w:rPr>
+          <w:b/>
+        </w:rPr>
         <w:t>Datenbasis</w:t>
       </w:r>
     </w:p>
@@ -4126,9 +4158,12 @@
     </w:p>
     <w:p>
       <w:pPr>
-        <w:pStyle w:val="berschrift2"/>
-      </w:pPr>
-      <w:r>
+        <w:pStyle w:val="berschrift3"/>
+      </w:pPr>
+      <w:r>
+        <w:rPr>
+          <w:b/>
+        </w:rPr>
         <w:t>Operationalisierung der Hypothesen</w:t>
       </w:r>
     </w:p>
@@ -4185,9 +4220,12 @@
     </w:p>
     <w:p>
       <w:pPr>
-        <w:pStyle w:val="berschrift2"/>
-      </w:pPr>
-      <w:r>
+        <w:pStyle w:val="berschrift3"/>
+      </w:pPr>
+      <w:r>
+        <w:rPr>
+          <w:b/>
+        </w:rPr>
         <w:t>Reproduzierbarkeit und Guardrails</w:t>
       </w:r>
     </w:p>
@@ -4219,7 +4257,7 @@
     </w:p>
     <w:p>
       <w:pPr>
-        <w:pStyle w:val="berschrift1"/>
+        <w:pStyle w:val="berschrift2"/>
       </w:pPr>
       <w:r>
         <w:t>H1: Prognosequalität</w:t>
@@ -4691,7 +4729,7 @@
     </w:p>
     <w:p>
       <w:pPr>
-        <w:pStyle w:val="berschrift1"/>
+        <w:pStyle w:val="berschrift2"/>
       </w:pPr>
       <w:r>
         <w:t>H2: Ereignisfenster</w:t>
@@ -5131,7 +5169,7 @@
     </w:p>
     <w:p>
       <w:pPr>
-        <w:pStyle w:val="berschrift1"/>
+        <w:pStyle w:val="berschrift2"/>
       </w:pPr>
       <w:r>
         <w:t>H3: Wallet-Timing</w:t>
@@ -5483,9 +5521,12 @@
     </w:p>
     <w:p>
       <w:pPr>
-        <w:pStyle w:val="berschrift2"/>
-      </w:pPr>
-      <w:r>
+        <w:pStyle w:val="berschrift3"/>
+      </w:pPr>
+      <w:r>
+        <w:rPr>
+          <w:b/>
+        </w:rPr>
         <w:t>Ereignis-Wallet-Anomalien als deskriptive Diagnostik</w:t>
       </w:r>
     </w:p>
@@ -5574,7 +5615,7 @@
     <w:p>
       <w:pPr/>
       <w:r>
-        <w:t>Die Diagnostik arbeitet ausschliesslich mit aggregierten Tier-Zählungen und gibt keine Wallet-Adressen aus. Sie ist als historische, deskriptive Auffälligkeits-Diagnostik zu lesen und liefert Prüf-Hinweise, kein Beweis von privater Information, Insiderhandel, Fehlverhalten, Kausalität oder Profitabilität. Die spätere Review-Schicht, die solche Hinweise einordnet, wird in Kapitel 7 beschrieben.</w:t>
+        <w:t>Die Diagnostik arbeitet ausschliesslich mit aggregierten Tier-Zählungen und gibt keine Wallet-Adressen aus. Sie ist als historische, deskriptive Auffälligkeits-Diagnostik zu lesen und liefert Prüf-Hinweise, kein Beweis von privater Information, Insiderhandel, Fehlverhalten, Kausalität oder Profitabilität. Die spätere Review-Schicht, die solche Hinweise einordnet, wird in Kapitel 4 beschrieben.</w:t>
       </w:r>
     </w:p>
     <w:p>
@@ -5596,9 +5637,12 @@
     </w:p>
     <w:p>
       <w:pPr>
-        <w:pStyle w:val="berschrift2"/>
-      </w:pPr>
-      <w:r>
+        <w:pStyle w:val="berschrift3"/>
+      </w:pPr>
+      <w:r>
+        <w:rPr>
+          <w:b/>
+        </w:rPr>
         <w:t>Signaturen informierten Handels und ein Verdachts-Profil</w:t>
       </w:r>
     </w:p>
@@ -5720,7 +5764,7 @@
     <w:p>
       <w:pPr/>
       <w:r>
-        <w:t>Daraus folgt ein Verdachts-Profil, das als Hypothese und Prüf-Filter dient. Ein Ereignisfenster ist prüfwürdig, wenn mehrere Signaturen gemeinsam auftreten – ein hoher Anteil neuer Wallets, hohe Konzentration, abnormale Aktiv-Wallet- und Volumen-Werte aus Abschnitt sowie ein Vorlauf der Tier-Aktivität vor der Preisbewegung aus der Lead-Lag- und Granger-Diagnostik. Genau diese Kombination speist die Review-Queue in Kapitel 7.</w:t>
+        <w:t>Daraus folgt ein Verdachts-Profil, das als Hypothese und Prüf-Filter dient. Ein Ereignisfenster ist prüfwürdig, wenn mehrere Signaturen gemeinsam auftreten – ein hoher Anteil neuer Wallets, hohe Konzentration, abnormale Aktiv-Wallet- und Volumen-Werte aus Abschnitt sowie ein Vorlauf der Tier-Aktivität vor der Preisbewegung aus der Lead-Lag- und Granger-Diagnostik. Genau diese Kombination speist die Review-Queue in Kapitel 4.</w:t>
       </w:r>
     </w:p>
     <w:p>
@@ -5762,7 +5806,67 @@
         <w:pStyle w:val="berschrift1"/>
       </w:pPr>
       <w:r>
-        <w:t>Erweiterungen: Monitor, Schweizer Abstimmung und praktischer Beitrag</w:t>
+        <w:t>Schlussfolgerung aus der Analyse</w:t>
+      </w:r>
+    </w:p>
+    <w:p>
+      <w:pPr>
+        <w:pStyle w:val="berschrift2"/>
+      </w:pPr>
+      <w:r>
+        <w:t>Synthese der Befunde</w:t>
+      </w:r>
+    </w:p>
+    <w:p>
+      <w:pPr/>
+      <w:r>
+        <w:t xml:space="preserve">Die drei Hypothesen ergeben ein konsistentes, aber bewusst begrenztes Bild. H1 zeigt eine Polymarket-Stärke nur in einem definierten Vergleichsscope (262 von 285 State-Date-Zeilen, 9 von 9 States), während die breite Überlegenheit ungedeckt bleibt und das volle Panel ein Gegenbeispiel liefert. H2 zeigt plausible tägliche Reaktionen auf kuratierte Ereignisse, am deutlichsten beim Attentat auf Trump. H3 findet im obersten Wallet-Tier das klarste prädiktive Timing-Muster. Zusammen stützen die Befunde </w:t>
+      </w:r>
+      <w:r>
+        <w:rPr>
+          <w:b w:val="0"/>
+          <w:i/>
+        </w:rPr>
+        <w:t>begrenzte</w:t>
+      </w:r>
+      <w:r>
+        <w:t xml:space="preserve"> Diagnosen informationeller Effizienz, keine universelle Aussage.</w:t>
+      </w:r>
+    </w:p>
+    <w:p>
+      <w:pPr>
+        <w:pStyle w:val="berschrift2"/>
+      </w:pPr>
+      <w:r>
+        <w:t>Einordnung in die Literatur</w:t>
+      </w:r>
+    </w:p>
+    <w:p>
+      <w:pPr/>
+      <w:r>
+        <w:t>Der begrenzte H1-Vorteil ist mit Cutting et al. (2025) vereinbar, die einen Polymarket-Vorteil besonders in Swing States berichten, zugleich aber zur Vorsicht bei Verallgemeinerung mahnen. Die kritische Lesart von Wu (2024) – Märkte als reflexive Informationsplattform, nicht als «Truth Machine» – passt zum Gegenbeispiel im vollen Panel. Die H3-Vorsicht deckt sich mit Tsang und Yang (2026), deren Grosskonto-Befund heterogene Erwartungen statt Manipulation nahelegt, sowie mit der konzeptionellen Insider-Rahmung bei Hanson (2007).</w:t>
+      </w:r>
+    </w:p>
+    <w:p>
+      <w:pPr>
+        <w:pStyle w:val="berschrift2"/>
+      </w:pPr>
+      <w:r>
+        <w:t>Folgerung für die Forschungsfrage</w:t>
+      </w:r>
+    </w:p>
+    <w:p>
+      <w:pPr/>
+      <w:r>
+        <w:t>Aus der Analyse folgt, dass Polymarket im untersuchten Kontext Information nachweisbar gut verarbeitet, aber nur in klar abgegrenzten Fällen messbar besser als traditionelle Quellen. Diese begrenzte, aber belastbare Diagnose motiviert den folgenden Lösungsteil: ein Werkzeug, das genau solche begrenzten, deterministisch geprüften Hinweise sichtbar und für Menschen prüfbar macht.</w:t>
+      </w:r>
+    </w:p>
+    <w:p>
+      <w:pPr>
+        <w:pStyle w:val="berschrift1"/>
+      </w:pPr>
+      <w:r>
+        <w:t>Lösung: Monitoring-Werkzeug und Agenten-Orchestrierung</w:t>
       </w:r>
     </w:p>
     <w:p>
@@ -5913,7 +6017,7 @@
         <w:pStyle w:val="berschrift1"/>
       </w:pPr>
       <w:r>
-        <w:t>Diskussion, Limitationen und Fazit</w:t>
+        <w:t>Allgemeine Schlussfolgerung und Einschränkungen</w:t>
       </w:r>
     </w:p>
     <w:p>
@@ -5921,23 +6025,13 @@
         <w:pStyle w:val="berschrift2"/>
       </w:pPr>
       <w:r>
-        <w:t>Synthese der Befunde</w:t>
+        <w:t>Gesamtfazit</w:t>
       </w:r>
     </w:p>
     <w:p>
       <w:pPr/>
       <w:r>
-        <w:t xml:space="preserve">Die drei Hypothesen ergeben ein konsistentes, aber bewusst begrenztes Bild. H1 zeigt eine Polymarket-Stärke nur in einem definierten Vergleichsscope (262 von 285 State-Date-Zeilen, 9 von 9 States), während die breite Überlegenheit ungedeckt bleibt und das volle Panel ein Gegenbeispiel liefert. H2 zeigt plausible tägliche Reaktionen auf kuratierte Ereignisse, am deutlichsten beim Attentat auf Trump. H3 findet im obersten Wallet-Tier das klarste prädiktive Timing-Muster. Zusammen stützen die Befunde </w:t>
-      </w:r>
-      <w:r>
-        <w:rPr>
-          <w:b w:val="0"/>
-          <w:i/>
-        </w:rPr>
-        <w:t>begrenzte</w:t>
-      </w:r>
-      <w:r>
-        <w:t xml:space="preserve"> Diagnosen informationeller Effizienz, keine universelle Aussage.</w:t>
+        <w:t>Auf die Forschungsfrage antwortet die Arbeit differenziert: Polymarket verarbeitet Information im untersuchten Kontext nachweisbar gut, aber nur in klar abgegrenzten Fällen messbar besser als traditionelle Quellen. Die Stärke der Arbeit liegt weniger in einer einzelnen grossen Behauptung als in der reproduzierbaren, deterministisch geprüften Trennung von gestützter und nicht gestützter Evidenz (Fama, 1970), ergänzt um ein lauffähiges Werkzeug, das diese Trennung operationalisiert.</w:t>
       </w:r>
     </w:p>
     <w:p>
@@ -5945,69 +6039,33 @@
         <w:pStyle w:val="berschrift2"/>
       </w:pPr>
       <w:r>
-        <w:t>Einordnung in die Literatur</w:t>
+        <w:t>Einschränkungen</w:t>
       </w:r>
     </w:p>
     <w:p>
       <w:pPr/>
       <w:r>
-        <w:t>Der begrenzte H1-Vorteil ist mit Cutting et al. (2025) vereinbar, die einen Polymarket-Vorteil besonders in Swing States berichten, zugleich aber zur Vorsicht bei Verallgemeinerung mahnen. Die kritische Lesart von Wu (2024) – Märkte als reflexive Informationsplattform, nicht als «Truth Machine» – passt zum Gegenbeispiel im vollen Panel. Die H3-Vorsicht deckt sich mit Tsang und Yang (2026), deren Grosskonto-Befund heterogene Erwartungen statt Manipulation nahelegt, sowie mit der konzeptionellen Insider-Rahmung bei Hanson (2007).</w:t>
-      </w:r>
-    </w:p>
-    <w:p>
-      <w:pPr>
-        <w:pStyle w:val="berschrift2"/>
-      </w:pPr>
-      <w:r>
-        <w:t>Limitationen</w:t>
+        <w:t>Die Evidenz stammt aus einem einzelnen Wahlkontext mit wiederholten Tageszeilen und erlaubt keine Mehr-Wahlen-Verallgemeinerung. H2 beruht auf Tagesdaten und identifiziert keine Intraday-Reaktionszeit (MacKinlay, 1997). Die H3-Wallet-Daten sind BUY-only und quellseitig gefiltert, die Ausrichtung erfolgt täglich, und über mehrere Tiers und Lags besteht ein Multiple-Testing-Problem (Granger, 1969). Verhaltensverzerrungen und erhöhte Volatilität (Rezabek, 2024) begrenzen die Tragweite zusätzlich. Das Werkzeug bleibt read-only und liefert Prüf-Hinweise, keine Beweise.</w:t>
+      </w:r>
+    </w:p>
+    <w:p>
+      <w:pPr>
+        <w:pStyle w:val="berschrift1"/>
+      </w:pPr>
+      <w:r>
+        <w:t>Nächste Schritte</w:t>
       </w:r>
     </w:p>
     <w:p>
       <w:pPr/>
       <w:r>
-        <w:t>Die Evidenz stammt aus einem einzelnen Wahlkontext mit wiederholten Tageszeilen und erlaubt keine Mehr-Wahlen-Verallgemeinerung. H2 beruht auf Tagesdaten und identifiziert keine Intraday-Reaktionszeit (MacKinlay, 1997). Die H3-Wallet-Daten sind BUY-only und quellseitig gefiltert, die Ausrichtung erfolgt täglich, und über mehrere Tiers und Lags besteht ein Multiple-Testing-Problem (Granger, 1969). Verhaltensverzerrungen und erhöhte Volatilität (Rezabek, 2024) begrenzen die Tragweite zusätzlich.</w:t>
-      </w:r>
-    </w:p>
-    <w:p>
-      <w:pPr>
-        <w:pStyle w:val="berschrift2"/>
-      </w:pPr>
-      <w:r>
-        <w:t>Fazit</w:t>
+        <w:t>Über den empirischen Kern hinaus lässt sich die in Kapitel 4 vorgestellte Lösung zu einer agentengestützten Assistenzschicht ausbauen, die künftig die Interpretation begrenzter, bereits berechneter Zusammenfassungen unterstützt, ohne selbst Kennzahlen zu berechnen.</w:t>
       </w:r>
     </w:p>
     <w:p>
       <w:pPr/>
       <w:r>
-        <w:t>Auf die Forschungsfrage antwortet die Arbeit differenziert: Polymarket verarbeitet Information im untersuchten Kontext nachweisbar gut, aber nur in klar abgegrenzten Fällen messbar besser als traditionelle Quellen. Die Stärke der Arbeit liegt weniger in einer einzelnen grossen Behauptung als in der reproduzierbaren, deterministisch geprüften Trennung von gestützter und nicht gestützter Evidenz (Fama, 1970).</w:t>
-      </w:r>
-    </w:p>
-    <w:p>
-      <w:pPr>
-        <w:pStyle w:val="berschrift2"/>
-      </w:pPr>
-      <w:r>
-        <w:t>Ausblick</w:t>
-      </w:r>
-    </w:p>
-    <w:p>
-      <w:pPr/>
-      <w:r>
-        <w:t>Über den empirischen Kern hinaus skizziert Kapitel 9 eine Agenten-gestützte Assistenzschicht, die künftig die Interpretation begrenzter, bereits berechneter Zusammenfassungen unterstützen kann, ohne selbst Kennzahlen zu berechnen.</w:t>
-      </w:r>
-    </w:p>
-    <w:p>
-      <w:pPr>
-        <w:pStyle w:val="berschrift1"/>
-      </w:pPr>
-      <w:r>
-        <w:t>Ausblick: Agenten-gestützte Pipeline</w:t>
-      </w:r>
-    </w:p>
-    <w:p>
-      <w:pPr/>
-      <w:r>
-        <w:t>Künftige Agenten dürfen Entwurfs-, Review- und Quellen-Prüf-Workflows nur aus begrenzten, bereits deterministisch berechneten Zusammenfassungen unterstützen. Sie berechnen keine Kennzahlen und greifen nicht ungefiltert auf Rohdaten zu, jede LLM-Interaktion wird protokolliert.</w:t>
+        <w:t>Künftige Agenten dürfen Entwurfs-, Review- und Quellen-Prüf-Workflows nur aus begrenzten, bereits deterministisch berechneten Zusammenfassungen unterstützen. Sie berechnen keine Kennzahlen und greifen nicht ungefiltert auf Rohdaten zu, jede LLM-Interaktion wird protokolliert. Als Aktivierungs-Gates gelten ein separates Goal, Tests, bounded inputs (maximal 50 Zeilen je Abfrage) und die Protokollierung jeder LLM-Interaktion. Weitere Schritte betreffen die Härtung der Verdachts-Signatur (Funding-Quellen, Wallet-Lebensdauer, Out-of-Sample-Test gegen dokumentierte Fälle), stets gebunden an die Audit- und Wallet-Adress-Grenzen.</w:t>
       </w:r>
     </w:p>
     <w:p>

</xml_diff>